<commit_message>
feat: enhance LLM interactions with validation and expanded coach selection
</commit_message>
<xml_diff>
--- a/output/rapport-project-meltdown-scia-2026.docx
+++ b/output/rapport-project-meltdown-scia-2026.docx
@@ -4,22 +4,7 @@
   <w:body>
     <w:p>
       <w:pPr>
-        <w:spacing w:before="1300" w:after="240"/>
-      </w:pPr>
-      <w:r>
-        <w:rPr>
-          <w:rFonts w:ascii="Aptos" w:hAnsi="Aptos"/>
-          <w:b/>
-          <w:color w:val="6F8E2F"/>
-          <w:sz w:val="20"/>
-        </w:rPr>
-        <w:t>RAPPORT DE PROJET</w:t>
-      </w:r>
-    </w:p>
-    <w:p>
-      <w:pPr>
         <w:pStyle w:val="Title"/>
-        <w:spacing w:after="160"/>
       </w:pPr>
       <w:r>
         <w:t>Project Meltdown</w:t>
@@ -27,156 +12,48 @@
     </w:p>
     <w:p>
       <w:pPr>
-        <w:spacing w:after="480"/>
+        <w:pStyle w:val="Subtitle"/>
       </w:pPr>
       <w:r>
-        <w:rPr>
-          <w:rFonts w:ascii="Aptos" w:hAnsi="Aptos"/>
-          <w:color w:val="17212B"/>
-          <w:sz w:val="32"/>
-        </w:rPr>
-        <w:t>Serious game multi-agent de gestion de crise</w:t>
+        <w:t>Rapport technique du serious game</w:t>
       </w:r>
     </w:p>
     <w:p>
       <w:pPr>
-        <w:spacing w:after="840" w:before="280"/>
-        <w:jc w:val="left"/>
+        <w:spacing w:after="140"/>
       </w:pPr>
       <w:r>
         <w:rPr>
-          <w:rFonts w:ascii="Aptos" w:hAnsi="Aptos" w:eastAsia="Aptos"/>
-          <w:b/>
-          <w:color w:val="526170"/>
-          <w:sz w:val="22"/>
+          <w:sz w:val="17"/>
         </w:rPr>
-        <w:t>Hackathon SCIA 2026 • Arthur Lefebvre • vérifié le 5 septembre 2026</w:t>
-      </w:r>
-    </w:p>
-    <w:p>
-      <w:pPr>
-        <w:spacing w:before="560" w:after="140"/>
-      </w:pPr>
-      <w:r>
-        <w:rPr>
-          <w:rFonts w:ascii="Aptos" w:hAnsi="Aptos"/>
-          <w:b/>
-          <w:color w:val="000000"/>
-          <w:sz w:val="30"/>
-        </w:rPr>
-        <w:t>Résumé</w:t>
-      </w:r>
-    </w:p>
-    <w:p>
-      <w:pPr>
-        <w:widowControl/>
-      </w:pPr>
-      <w:r>
-        <w:t>Project Meltdown est un serious game court qui place le joueur dans le rôle d'un Product Owner confronté à une crise projet. Le joueur donne des consignes en langage naturel à quatre personnages pilotés par un modèle, tandis qu'un moteur de règles conserve la maîtrise des conséquences. Le rapport suit une partie complète depuis le briefing jusqu'au débrief : la livraison aboutit en cinq tours avec 100 % de progression, un budget de 34/100, une confiance client de 73/100, un moral de 60/100 et une sécurité vérifiée.</w:t>
-      </w:r>
-    </w:p>
-    <w:p>
-      <w:pPr>
-        <w:widowControl/>
-      </w:pPr>
-      <w:r>
-        <w:rPr>
-          <w:b/>
-        </w:rPr>
-        <w:t xml:space="preserve">Idée centrale. </w:t>
-      </w:r>
-      <w:r>
-        <w:t>Pour ce projet, j'ai choisi une architecture hybride : l'IA interprète et propose des intentions, mais elle ne modifie jamais directement les métriques du jeu. Cette séparation apporte une interaction naturelle tout en conservant la traçabilité attendue dans un serious game.</w:t>
-      </w:r>
-    </w:p>
-    <w:p>
-      <w:pPr>
-        <w:spacing w:before="400"/>
-      </w:pPr>
-      <w:r>
-        <w:t>Serious game multi-agent   •   Décisions en langage naturel   •   Débrief explicable</w:t>
-      </w:r>
-    </w:p>
-    <w:p>
-      <w:r>
-        <w:br w:type="page"/>
+        <w:t>Hackathon SCIA 2026 · Arthur Lefebvre</w:t>
       </w:r>
     </w:p>
     <w:p>
       <w:pPr>
         <w:pStyle w:val="Heading1"/>
-        <w:keepNext/>
       </w:pPr>
       <w:r>
-        <w:t>1  Concept et expérience de jeu</w:t>
+        <w:t>1  Le projet et les règles du jeu</w:t>
+      </w:r>
+    </w:p>
+    <w:p>
+      <w:pPr/>
+      <w:r>
+        <w:t>Project Meltdown simule la livraison d’un projet numérique sous pression. Le joueur incarne un Product Owner et donne des consignes en langage naturel à quatre personnages. L’architecture associe des modèles de langage pour interpréter et dialoguer, un moteur déterministe pour calculer les conséquences, et un graphe persistant pour coordonner les échanges.</w:t>
       </w:r>
     </w:p>
     <w:p>
       <w:pPr>
-        <w:widowControl/>
-      </w:pPr>
-      <w:r>
-        <w:t>Le scénario place le Product Owner à trois jours d'une échéance critique. Un défaut technique doit être évalué, une fonctionnalité supplémentaire a été promise et la capacité de l'équipe est limitée. L'objectif est de faire vivre des arbitrages concrets : rechercher l'information, négocier un engagement réaliste et vérifier la sécurité avant de livrer.</w:t>
-      </w:r>
-    </w:p>
-    <w:p>
-      <w:pPr>
-        <w:widowControl/>
-      </w:pPr>
-      <w:r>
-        <w:t>Le joueur dispose de six tours et de quatre interlocuteurs complémentaires :</w:t>
-      </w:r>
-    </w:p>
-    <w:p>
-      <w:pPr>
-        <w:pStyle w:val="ListBullet"/>
-        <w:spacing w:after="80"/>
-        <w:ind w:left="317" w:hanging="202"/>
-      </w:pPr>
-      <w:r>
-        <w:t>Alex, responsable du développement, transforme les priorités en travail et signale la surcharge.</w:t>
-      </w:r>
-    </w:p>
-    <w:p>
-      <w:pPr>
-        <w:pStyle w:val="ListBullet"/>
-        <w:spacing w:after="80"/>
-        <w:ind w:left="317" w:hanging="202"/>
-      </w:pPr>
-      <w:r>
-        <w:t>Camille, côté client, révèle le besoin réel et accepte ou refuse les propositions de périmètre.</w:t>
-      </w:r>
-    </w:p>
-    <w:p>
-      <w:pPr>
-        <w:pStyle w:val="ListBullet"/>
-        <w:spacing w:after="80"/>
-        <w:ind w:left="317" w:hanging="202"/>
-      </w:pPr>
-      <w:r>
-        <w:t>Sam, côté commercial, porte la promesse initiale et la communication de l'engagement.</w:t>
-      </w:r>
-    </w:p>
-    <w:p>
-      <w:pPr>
-        <w:pStyle w:val="ListBullet"/>
-        <w:spacing w:after="80"/>
-        <w:ind w:left="317" w:hanging="202"/>
-      </w:pPr>
-      <w:r>
-        <w:t>Morgan, côté sécurité, audite le risque et valide la correction avant une livraison.</w:t>
-      </w:r>
-    </w:p>
-    <w:p>
-      <w:pPr>
-        <w:spacing w:before="80" w:after="0"/>
+        <w:keepNext/>
+        <w:spacing w:after="60"/>
         <w:jc w:val="center"/>
       </w:pPr>
       <w:r>
         <w:drawing>
           <wp:inline xmlns:a="http://schemas.openxmlformats.org/drawingml/2006/main" xmlns:pic="http://schemas.openxmlformats.org/drawingml/2006/picture">
-            <wp:extent cx="6355080" cy="3574732"/>
-            <wp:docPr id="1" name="Picture 1" descr="Capture de l'état initial de Project Meltdown avec les métriques et le bureau 3D."/>
+            <wp:extent cx="5943600" cy="3343275"/>
+            <wp:docPr id="1" name="Picture 1"/>
             <wp:cNvGraphicFramePr>
               <a:graphicFrameLocks noChangeAspect="1"/>
             </wp:cNvGraphicFramePr>
@@ -189,2603 +66,6 @@
                   </pic:nvPicPr>
                   <pic:blipFill>
                     <a:blip r:embed="rId11"/>
-                    <a:stretch>
-                      <a:fillRect/>
-                    </a:stretch>
-                  </pic:blipFill>
-                  <pic:spPr>
-                    <a:xfrm>
-                      <a:off x="0" y="0"/>
-                      <a:ext cx="6355080" cy="3574732"/>
-                    </a:xfrm>
-                    <a:prstGeom prst="rect"/>
-                  </pic:spPr>
-                </pic:pic>
-              </a:graphicData>
-            </a:graphic>
-          </wp:inline>
-        </w:drawing>
-      </w:r>
-    </w:p>
-    <w:p>
-      <w:pPr>
-        <w:spacing w:before="80" w:after="160"/>
-        <w:jc w:val="center"/>
-      </w:pPr>
-      <w:r>
-        <w:t>Figure 1 - Briefing, indicateurs, personnages et consigne libre. Source : prototype (jeu-briefing.png).</w:t>
-      </w:r>
-    </w:p>
-    <w:p>
-      <w:r>
-        <w:br w:type="page"/>
-      </w:r>
-    </w:p>
-    <w:p>
-      <w:pPr>
-        <w:pStyle w:val="Heading1"/>
-        <w:keepNext/>
-      </w:pPr>
-      <w:r>
-        <w:t>2  Déroulement d'un parcours</w:t>
-      </w:r>
-    </w:p>
-    <w:p>
-      <w:pPr>
-        <w:widowControl/>
-      </w:pPr>
-      <w:r>
-        <w:t>Un parcours de démonstration commence par l'audit de l'alerte et la clarification du besoin client. Le joueur peut ensuite négocier un périmètre réduit, donner la priorité au correctif, faire vérifier la sécurité, terminer le socle puis livrer la version convenue.</w:t>
-      </w:r>
-    </w:p>
-    <w:tbl>
-      <w:tblPr>
-        <w:tblStyle w:val="TableGrid"/>
-        <w:tblW w:type="auto" w:w="0"/>
-        <w:jc w:val="center"/>
-        <w:tblLayout w:type="fixed"/>
-        <w:tblLook w:firstColumn="1" w:firstRow="1" w:lastColumn="0" w:lastRow="0" w:noHBand="0" w:noVBand="1" w:val="04A0"/>
-        <w:tblBorders>
-          <w:top w:val="single" w:sz="5" w:color="D9D9D9"/>
-          <w:left w:val="single" w:sz="5" w:color="D9D9D9"/>
-          <w:bottom w:val="single" w:sz="5" w:color="D9D9D9"/>
-          <w:right w:val="single" w:sz="5" w:color="D9D9D9"/>
-          <w:insideH w:val="single" w:sz="5" w:color="D9D9D9"/>
-          <w:insideV w:val="single" w:sz="5" w:color="D9D9D9"/>
-        </w:tblBorders>
-      </w:tblPr>
-      <w:tblGrid>
-        <w:gridCol w:w="3389"/>
-        <w:gridCol w:w="3389"/>
-        <w:gridCol w:w="3389"/>
-      </w:tblGrid>
-      <w:tr>
-        <w:trPr>
-          <w:tblHeader w:val="true"/>
-          <w:cantSplit/>
-        </w:trPr>
-        <w:tc>
-          <w:tcPr>
-            <w:tcW w:type="dxa" w:w="792"/>
-            <w:shd w:fill="17212B"/>
-            <w:vAlign w:val="center"/>
-            <w:tcMar>
-              <w:top w:w="110" w:type="dxa"/>
-              <w:start w:w="120" w:type="dxa"/>
-              <w:bottom w:w="110" w:type="dxa"/>
-              <w:end w:w="120" w:type="dxa"/>
-            </w:tcMar>
-          </w:tcPr>
-          <w:p>
-            <w:pPr>
-              <w:jc w:val="left"/>
-            </w:pPr>
-            <w:r>
-              <w:rPr>
-                <w:rFonts w:ascii="Aptos" w:hAnsi="Aptos"/>
-                <w:b/>
-                <w:color w:val="FFFFFF"/>
-                <w:sz w:val="18"/>
-              </w:rPr>
-              <w:t>Tour</w:t>
-            </w:r>
-          </w:p>
-        </w:tc>
-        <w:tc>
-          <w:tcPr>
-            <w:tcW w:type="dxa" w:w="3600"/>
-            <w:shd w:fill="17212B"/>
-            <w:vAlign w:val="center"/>
-            <w:tcMar>
-              <w:top w:w="110" w:type="dxa"/>
-              <w:start w:w="120" w:type="dxa"/>
-              <w:bottom w:w="110" w:type="dxa"/>
-              <w:end w:w="120" w:type="dxa"/>
-            </w:tcMar>
-          </w:tcPr>
-          <w:p>
-            <w:r>
-              <w:rPr>
-                <w:rFonts w:ascii="Aptos" w:hAnsi="Aptos" w:eastAsia="Aptos"/>
-                <w:b/>
-                <w:color w:val="FFFFFF"/>
-                <w:sz w:val="18"/>
-              </w:rPr>
-              <w:t>Décision du joueur</w:t>
-            </w:r>
-          </w:p>
-        </w:tc>
-        <w:tc>
-          <w:tcPr>
-            <w:tcW w:type="dxa" w:w="5688"/>
-            <w:shd w:fill="17212B"/>
-            <w:vAlign w:val="center"/>
-            <w:tcMar>
-              <w:top w:w="110" w:type="dxa"/>
-              <w:start w:w="120" w:type="dxa"/>
-              <w:bottom w:w="110" w:type="dxa"/>
-              <w:end w:w="120" w:type="dxa"/>
-            </w:tcMar>
-          </w:tcPr>
-          <w:p>
-            <w:pPr>
-              <w:jc w:val="left"/>
-            </w:pPr>
-            <w:r>
-              <w:rPr>
-                <w:rFonts w:ascii="Aptos" w:hAnsi="Aptos"/>
-                <w:b/>
-                <w:color w:val="FFFFFF"/>
-                <w:sz w:val="18"/>
-              </w:rPr>
-              <w:t>Conséquence observée</w:t>
-            </w:r>
-          </w:p>
-        </w:tc>
-      </w:tr>
-      <w:tr>
-        <w:trPr>
-          <w:cantSplit/>
-        </w:trPr>
-        <w:tc>
-          <w:tcPr>
-            <w:tcW w:type="dxa" w:w="792"/>
-            <w:vAlign w:val="center"/>
-            <w:tcMar>
-              <w:top w:w="110" w:type="dxa"/>
-              <w:start w:w="120" w:type="dxa"/>
-              <w:bottom w:w="110" w:type="dxa"/>
-              <w:end w:w="120" w:type="dxa"/>
-            </w:tcMar>
-          </w:tcPr>
-          <w:p>
-            <w:pPr>
-              <w:spacing w:after="0"/>
-            </w:pPr>
-            <w:r>
-              <w:rPr>
-                <w:rFonts w:ascii="Aptos" w:hAnsi="Aptos"/>
-                <w:color w:val="000000"/>
-                <w:sz w:val="17"/>
-              </w:rPr>
-              <w:t>1</w:t>
-            </w:r>
-          </w:p>
-        </w:tc>
-        <w:tc>
-          <w:tcPr>
-            <w:tcW w:type="dxa" w:w="3600"/>
-            <w:vAlign w:val="center"/>
-            <w:tcMar>
-              <w:top w:w="110" w:type="dxa"/>
-              <w:start w:w="120" w:type="dxa"/>
-              <w:bottom w:w="110" w:type="dxa"/>
-              <w:end w:w="120" w:type="dxa"/>
-            </w:tcMar>
-          </w:tcPr>
-          <w:p>
-            <w:pPr>
-              <w:spacing w:after="0"/>
-            </w:pPr>
-            <w:r>
-              <w:rPr>
-                <w:rFonts w:ascii="Aptos" w:hAnsi="Aptos"/>
-                <w:color w:val="000000"/>
-                <w:sz w:val="17"/>
-              </w:rPr>
-              <w:t>Auditer le défaut et clarifier le besoin</w:t>
-            </w:r>
-          </w:p>
-        </w:tc>
-        <w:tc>
-          <w:tcPr>
-            <w:tcW w:type="dxa" w:w="5688"/>
-            <w:vAlign w:val="center"/>
-            <w:tcMar>
-              <w:top w:w="110" w:type="dxa"/>
-              <w:start w:w="120" w:type="dxa"/>
-              <w:bottom w:w="110" w:type="dxa"/>
-              <w:end w:w="120" w:type="dxa"/>
-            </w:tcMar>
-          </w:tcPr>
-          <w:p>
-            <w:pPr>
-              <w:spacing w:after="0"/>
-            </w:pPr>
-            <w:r>
-              <w:rPr>
-                <w:rFonts w:ascii="Aptos" w:hAnsi="Aptos"/>
-                <w:color w:val="000000"/>
-                <w:sz w:val="17"/>
-              </w:rPr>
-              <w:t>Risque critique confirmé ; une démonstration réduite devient acceptable</w:t>
-            </w:r>
-          </w:p>
-        </w:tc>
-      </w:tr>
-      <w:tr>
-        <w:trPr>
-          <w:cantSplit/>
-        </w:trPr>
-        <w:tc>
-          <w:tcPr>
-            <w:tcW w:type="dxa" w:w="792"/>
-            <w:vAlign w:val="center"/>
-            <w:tcMar>
-              <w:top w:w="110" w:type="dxa"/>
-              <w:start w:w="120" w:type="dxa"/>
-              <w:bottom w:w="110" w:type="dxa"/>
-              <w:end w:w="120" w:type="dxa"/>
-            </w:tcMar>
-            <w:shd w:fill="F7F9FA"/>
-          </w:tcPr>
-          <w:p>
-            <w:pPr>
-              <w:spacing w:after="0"/>
-            </w:pPr>
-            <w:r>
-              <w:rPr>
-                <w:rFonts w:ascii="Aptos" w:hAnsi="Aptos"/>
-                <w:color w:val="000000"/>
-                <w:sz w:val="17"/>
-              </w:rPr>
-              <w:t>2</w:t>
-            </w:r>
-          </w:p>
-        </w:tc>
-        <w:tc>
-          <w:tcPr>
-            <w:tcW w:type="dxa" w:w="3600"/>
-            <w:vAlign w:val="center"/>
-            <w:tcMar>
-              <w:top w:w="110" w:type="dxa"/>
-              <w:start w:w="120" w:type="dxa"/>
-              <w:bottom w:w="110" w:type="dxa"/>
-              <w:end w:w="120" w:type="dxa"/>
-            </w:tcMar>
-            <w:shd w:fill="F7F9FA"/>
-          </w:tcPr>
-          <w:p>
-            <w:pPr>
-              <w:spacing w:after="0"/>
-            </w:pPr>
-            <w:r>
-              <w:rPr>
-                <w:rFonts w:ascii="Aptos" w:hAnsi="Aptos"/>
-                <w:color w:val="000000"/>
-                <w:sz w:val="17"/>
-              </w:rPr>
-              <w:t>Prioriser le correctif et négocier</w:t>
-            </w:r>
-          </w:p>
-        </w:tc>
-        <w:tc>
-          <w:tcPr>
-            <w:tcW w:type="dxa" w:w="5688"/>
-            <w:vAlign w:val="center"/>
-            <w:tcMar>
-              <w:top w:w="110" w:type="dxa"/>
-              <w:start w:w="120" w:type="dxa"/>
-              <w:bottom w:w="110" w:type="dxa"/>
-              <w:end w:w="120" w:type="dxa"/>
-            </w:tcMar>
-            <w:shd w:fill="F7F9FA"/>
-          </w:tcPr>
-          <w:p>
-            <w:pPr>
-              <w:spacing w:after="0"/>
-            </w:pPr>
-            <w:r>
-              <w:rPr>
-                <w:rFonts w:ascii="Aptos" w:hAnsi="Aptos"/>
-                <w:color w:val="000000"/>
-                <w:sz w:val="17"/>
-              </w:rPr>
-              <w:t>Périmètre réduit accepté ; le correctif progresse</w:t>
-            </w:r>
-          </w:p>
-        </w:tc>
-      </w:tr>
-      <w:tr>
-        <w:trPr>
-          <w:cantSplit/>
-        </w:trPr>
-        <w:tc>
-          <w:tcPr>
-            <w:tcW w:type="dxa" w:w="792"/>
-            <w:vAlign w:val="center"/>
-            <w:tcMar>
-              <w:top w:w="110" w:type="dxa"/>
-              <w:start w:w="120" w:type="dxa"/>
-              <w:bottom w:w="110" w:type="dxa"/>
-              <w:end w:w="120" w:type="dxa"/>
-            </w:tcMar>
-          </w:tcPr>
-          <w:p>
-            <w:pPr>
-              <w:spacing w:after="0"/>
-            </w:pPr>
-            <w:r>
-              <w:rPr>
-                <w:rFonts w:ascii="Aptos" w:hAnsi="Aptos"/>
-                <w:color w:val="000000"/>
-                <w:sz w:val="17"/>
-              </w:rPr>
-              <w:t>3</w:t>
-            </w:r>
-          </w:p>
-        </w:tc>
-        <w:tc>
-          <w:tcPr>
-            <w:tcW w:type="dxa" w:w="3600"/>
-            <w:vAlign w:val="center"/>
-            <w:tcMar>
-              <w:top w:w="110" w:type="dxa"/>
-              <w:start w:w="120" w:type="dxa"/>
-              <w:bottom w:w="110" w:type="dxa"/>
-              <w:end w:w="120" w:type="dxa"/>
-            </w:tcMar>
-          </w:tcPr>
-          <w:p>
-            <w:pPr>
-              <w:spacing w:after="0"/>
-            </w:pPr>
-            <w:r>
-              <w:rPr>
-                <w:rFonts w:ascii="Aptos" w:hAnsi="Aptos"/>
-                <w:color w:val="000000"/>
-                <w:sz w:val="17"/>
-              </w:rPr>
-              <w:t>Terminer le correctif et communiquer</w:t>
-            </w:r>
-          </w:p>
-        </w:tc>
-        <w:tc>
-          <w:tcPr>
-            <w:tcW w:type="dxa" w:w="5688"/>
-            <w:vAlign w:val="center"/>
-            <w:tcMar>
-              <w:top w:w="110" w:type="dxa"/>
-              <w:start w:w="120" w:type="dxa"/>
-              <w:bottom w:w="110" w:type="dxa"/>
-              <w:end w:w="120" w:type="dxa"/>
-            </w:tcMar>
-          </w:tcPr>
-          <w:p>
-            <w:pPr>
-              <w:spacing w:after="0"/>
-            </w:pPr>
-            <w:r>
-              <w:rPr>
-                <w:rFonts w:ascii="Aptos" w:hAnsi="Aptos"/>
-                <w:color w:val="000000"/>
-                <w:sz w:val="17"/>
-              </w:rPr>
-              <w:t>Correction terminée ; état partagé aux parties prenantes</w:t>
-            </w:r>
-          </w:p>
-        </w:tc>
-      </w:tr>
-      <w:tr>
-        <w:trPr>
-          <w:cantSplit/>
-        </w:trPr>
-        <w:tc>
-          <w:tcPr>
-            <w:tcW w:type="dxa" w:w="792"/>
-            <w:vAlign w:val="center"/>
-            <w:tcMar>
-              <w:top w:w="110" w:type="dxa"/>
-              <w:start w:w="120" w:type="dxa"/>
-              <w:bottom w:w="110" w:type="dxa"/>
-              <w:end w:w="120" w:type="dxa"/>
-            </w:tcMar>
-            <w:shd w:fill="F7F9FA"/>
-          </w:tcPr>
-          <w:p>
-            <w:pPr>
-              <w:spacing w:after="0"/>
-            </w:pPr>
-            <w:r>
-              <w:rPr>
-                <w:rFonts w:ascii="Aptos" w:hAnsi="Aptos"/>
-                <w:color w:val="000000"/>
-                <w:sz w:val="17"/>
-              </w:rPr>
-              <w:t>4</w:t>
-            </w:r>
-          </w:p>
-        </w:tc>
-        <w:tc>
-          <w:tcPr>
-            <w:tcW w:type="dxa" w:w="3600"/>
-            <w:vAlign w:val="center"/>
-            <w:tcMar>
-              <w:top w:w="110" w:type="dxa"/>
-              <w:start w:w="120" w:type="dxa"/>
-              <w:bottom w:w="110" w:type="dxa"/>
-              <w:end w:w="120" w:type="dxa"/>
-            </w:tcMar>
-            <w:shd w:fill="F7F9FA"/>
-          </w:tcPr>
-          <w:p>
-            <w:pPr>
-              <w:spacing w:after="0"/>
-            </w:pPr>
-            <w:r>
-              <w:rPr>
-                <w:rFonts w:ascii="Aptos" w:hAnsi="Aptos"/>
-                <w:color w:val="000000"/>
-                <w:sz w:val="17"/>
-              </w:rPr>
-              <w:t>Vérifier la correction et reprendre le socle</w:t>
-            </w:r>
-          </w:p>
-        </w:tc>
-        <w:tc>
-          <w:tcPr>
-            <w:tcW w:type="dxa" w:w="5688"/>
-            <w:vAlign w:val="center"/>
-            <w:tcMar>
-              <w:top w:w="110" w:type="dxa"/>
-              <w:start w:w="120" w:type="dxa"/>
-              <w:bottom w:w="110" w:type="dxa"/>
-              <w:end w:w="120" w:type="dxa"/>
-            </w:tcMar>
-            <w:shd w:fill="F7F9FA"/>
-          </w:tcPr>
-          <w:p>
-            <w:pPr>
-              <w:spacing w:after="0"/>
-            </w:pPr>
-            <w:r>
-              <w:rPr>
-                <w:rFonts w:ascii="Aptos" w:hAnsi="Aptos"/>
-                <w:color w:val="000000"/>
-                <w:sz w:val="17"/>
-              </w:rPr>
-              <w:t>Sécurité validée ; socle terminé</w:t>
-            </w:r>
-          </w:p>
-        </w:tc>
-      </w:tr>
-      <w:tr>
-        <w:trPr>
-          <w:cantSplit/>
-        </w:trPr>
-        <w:tc>
-          <w:tcPr>
-            <w:tcW w:type="dxa" w:w="792"/>
-            <w:vAlign w:val="center"/>
-            <w:tcMar>
-              <w:top w:w="110" w:type="dxa"/>
-              <w:start w:w="120" w:type="dxa"/>
-              <w:bottom w:w="110" w:type="dxa"/>
-              <w:end w:w="120" w:type="dxa"/>
-            </w:tcMar>
-          </w:tcPr>
-          <w:p>
-            <w:pPr>
-              <w:spacing w:after="0"/>
-            </w:pPr>
-            <w:r>
-              <w:rPr>
-                <w:rFonts w:ascii="Aptos" w:hAnsi="Aptos"/>
-                <w:color w:val="000000"/>
-                <w:sz w:val="17"/>
-              </w:rPr>
-              <w:t>5</w:t>
-            </w:r>
-          </w:p>
-        </w:tc>
-        <w:tc>
-          <w:tcPr>
-            <w:tcW w:type="dxa" w:w="3600"/>
-            <w:vAlign w:val="center"/>
-            <w:tcMar>
-              <w:top w:w="110" w:type="dxa"/>
-              <w:start w:w="120" w:type="dxa"/>
-              <w:bottom w:w="110" w:type="dxa"/>
-              <w:end w:w="120" w:type="dxa"/>
-            </w:tcMar>
-          </w:tcPr>
-          <w:p>
-            <w:pPr>
-              <w:spacing w:after="0"/>
-            </w:pPr>
-            <w:r>
-              <w:rPr>
-                <w:rFonts w:ascii="Aptos" w:hAnsi="Aptos"/>
-                <w:color w:val="000000"/>
-                <w:sz w:val="17"/>
-              </w:rPr>
-              <w:t>Livrer le périmètre convenu</w:t>
-            </w:r>
-          </w:p>
-        </w:tc>
-        <w:tc>
-          <w:tcPr>
-            <w:tcW w:type="dxa" w:w="5688"/>
-            <w:vAlign w:val="center"/>
-            <w:tcMar>
-              <w:top w:w="110" w:type="dxa"/>
-              <w:start w:w="120" w:type="dxa"/>
-              <w:bottom w:w="110" w:type="dxa"/>
-              <w:end w:w="120" w:type="dxa"/>
-            </w:tcMar>
-          </w:tcPr>
-          <w:p>
-            <w:pPr>
-              <w:spacing w:after="0"/>
-            </w:pPr>
-            <w:r>
-              <w:rPr>
-                <w:rFonts w:ascii="Aptos" w:hAnsi="Aptos"/>
-                <w:color w:val="000000"/>
-                <w:sz w:val="17"/>
-              </w:rPr>
-              <w:t>Livraison contrôlée et débrief final</w:t>
-            </w:r>
-          </w:p>
-        </w:tc>
-      </w:tr>
-    </w:tbl>
-    <w:p>
-      <w:pPr>
-        <w:spacing w:after="0"/>
-      </w:pPr>
-    </w:p>
-    <w:p>
-      <w:pPr>
-        <w:spacing w:before="80" w:after="0"/>
-        <w:jc w:val="center"/>
-      </w:pPr>
-      <w:r>
-        <w:drawing>
-          <wp:inline xmlns:a="http://schemas.openxmlformats.org/drawingml/2006/main" xmlns:pic="http://schemas.openxmlformats.org/drawingml/2006/picture">
-            <wp:extent cx="6355080" cy="3574732"/>
-            <wp:docPr id="2" name="Picture 2" descr="Capture de la partie au deuxième tour avec la salle de crise, les personnages et le travail en cours."/>
-            <wp:cNvGraphicFramePr>
-              <a:graphicFrameLocks noChangeAspect="1"/>
-            </wp:cNvGraphicFramePr>
-            <a:graphic>
-              <a:graphicData uri="http://schemas.openxmlformats.org/drawingml/2006/picture">
-                <pic:pic>
-                  <pic:nvPicPr>
-                    <pic:cNvPr id="0" name="jeu-tour-2.png"/>
-                    <pic:cNvPicPr/>
-                  </pic:nvPicPr>
-                  <pic:blipFill>
-                    <a:blip r:embed="rId12"/>
-                    <a:stretch>
-                      <a:fillRect/>
-                    </a:stretch>
-                  </pic:blipFill>
-                  <pic:spPr>
-                    <a:xfrm>
-                      <a:off x="0" y="0"/>
-                      <a:ext cx="6355080" cy="3574732"/>
-                    </a:xfrm>
-                    <a:prstGeom prst="rect"/>
-                  </pic:spPr>
-                </pic:pic>
-              </a:graphicData>
-            </a:graphic>
-          </wp:inline>
-        </w:drawing>
-      </w:r>
-    </w:p>
-    <w:p>
-      <w:pPr>
-        <w:spacing w:before="80" w:after="160"/>
-        <w:jc w:val="center"/>
-      </w:pPr>
-      <w:r>
-        <w:t>Figure 2 - Tour 2 : consigne interprétée, agents et conséquences. Source : prototype (jeu-tour-2.png).</w:t>
-      </w:r>
-    </w:p>
-    <w:p>
-      <w:pPr>
-        <w:widowControl/>
-      </w:pPr>
-      <w:r>
-        <w:t>Le parcours n'est pas une séquence figée dans l'interface : chaque consigne est interprétée, validée, distribuée aux personnages puis résolue dans l'état persistant. Les tâches acceptées continuent également d'un tour à l'autre.</w:t>
-      </w:r>
-    </w:p>
-    <w:p>
-      <w:r>
-        <w:br w:type="page"/>
-      </w:r>
-    </w:p>
-    <w:p>
-      <w:pPr>
-        <w:pStyle w:val="Heading1"/>
-        <w:keepNext/>
-      </w:pPr>
-      <w:r>
-        <w:t>3  Architecture et technologies</w:t>
-      </w:r>
-    </w:p>
-    <w:p>
-      <w:pPr>
-        <w:spacing w:before="80" w:after="0"/>
-        <w:jc w:val="center"/>
-      </w:pPr>
-      <w:r>
-        <w:drawing>
-          <wp:inline xmlns:a="http://schemas.openxmlformats.org/drawingml/2006/main" xmlns:pic="http://schemas.openxmlformats.org/drawingml/2006/picture">
-            <wp:extent cx="6172200" cy="2811780"/>
-            <wp:docPr id="3" name="Picture 3" descr="Diagramme montrant le passage d'une consigne du joueur vers l'interpréteur, LangGraph, le moteur de règles et SQLite."/>
-            <wp:cNvGraphicFramePr>
-              <a:graphicFrameLocks noChangeAspect="1"/>
-            </wp:cNvGraphicFramePr>
-            <a:graphic>
-              <a:graphicData uri="http://schemas.openxmlformats.org/drawingml/2006/picture">
-                <pic:pic>
-                  <pic:nvPicPr>
-                    <pic:cNvPr id="0" name="architecture-project-meltdown.png"/>
-                    <pic:cNvPicPr/>
-                  </pic:nvPicPr>
-                  <pic:blipFill>
-                    <a:blip r:embed="rId13"/>
-                    <a:stretch>
-                      <a:fillRect/>
-                    </a:stretch>
-                  </pic:blipFill>
-                  <pic:spPr>
-                    <a:xfrm>
-                      <a:off x="0" y="0"/>
-                      <a:ext cx="6172200" cy="2811780"/>
-                    </a:xfrm>
-                    <a:prstGeom prst="rect"/>
-                  </pic:spPr>
-                </pic:pic>
-              </a:graphicData>
-            </a:graphic>
-          </wp:inline>
-        </w:drawing>
-      </w:r>
-    </w:p>
-    <w:p>
-      <w:pPr>
-        <w:spacing w:before="80" w:after="160"/>
-        <w:jc w:val="center"/>
-      </w:pPr>
-      <w:r>
-        <w:rPr>
-          <w:rFonts w:ascii="Aptos" w:hAnsi="Aptos"/>
-          <w:i/>
-          <w:color w:val="526170"/>
-          <w:sz w:val="17"/>
-        </w:rPr>
-        <w:t>Figure 3 - Chaîne principale de traitement d'une consigne joueur.</w:t>
-      </w:r>
-    </w:p>
-    <w:p>
-      <w:pPr>
-        <w:widowControl/>
-      </w:pPr>
-      <w:r>
-        <w:t>L'architecture sépare les responsabilités pour rendre la simulation contrôlable. L'interpréteur convertit une phrase en zéro, une ou deux actions autorisées. LangGraph distribue ensuite un contexte filtré aux personnages. Le moteur vérifie leurs intentions, applique les coûts et fait avancer le temps une seule fois. Enfin, SQLite enregistre la partie et ses checkpoints avant que le navigateur reçoive une projection publique.</w:t>
-      </w:r>
-    </w:p>
-    <w:tbl>
-      <w:tblPr>
-        <w:tblStyle w:val="TableGrid"/>
-        <w:tblW w:type="auto" w:w="0"/>
-        <w:jc w:val="center"/>
-        <w:tblLayout w:type="fixed"/>
-        <w:tblLook w:firstColumn="1" w:firstRow="1" w:lastColumn="0" w:lastRow="0" w:noHBand="0" w:noVBand="1" w:val="04A0"/>
-        <w:tblBorders>
-          <w:top w:val="single" w:sz="5" w:color="D9D9D9"/>
-          <w:left w:val="single" w:sz="5" w:color="D9D9D9"/>
-          <w:bottom w:val="single" w:sz="5" w:color="D9D9D9"/>
-          <w:right w:val="single" w:sz="5" w:color="D9D9D9"/>
-          <w:insideH w:val="single" w:sz="5" w:color="D9D9D9"/>
-          <w:insideV w:val="single" w:sz="5" w:color="D9D9D9"/>
-        </w:tblBorders>
-      </w:tblPr>
-      <w:tblGrid>
-        <w:gridCol w:w="3389"/>
-        <w:gridCol w:w="3389"/>
-        <w:gridCol w:w="3389"/>
-      </w:tblGrid>
-      <w:tr>
-        <w:trPr>
-          <w:tblHeader w:val="true"/>
-          <w:cantSplit/>
-        </w:trPr>
-        <w:tc>
-          <w:tcPr>
-            <w:tcW w:type="dxa" w:w="1656"/>
-            <w:shd w:fill="17212B"/>
-            <w:vAlign w:val="center"/>
-            <w:tcMar>
-              <w:top w:w="110" w:type="dxa"/>
-              <w:start w:w="120" w:type="dxa"/>
-              <w:bottom w:w="110" w:type="dxa"/>
-              <w:end w:w="120" w:type="dxa"/>
-            </w:tcMar>
-          </w:tcPr>
-          <w:p>
-            <w:pPr>
-              <w:jc w:val="left"/>
-            </w:pPr>
-            <w:r>
-              <w:rPr>
-                <w:rFonts w:ascii="Aptos" w:hAnsi="Aptos"/>
-                <w:b/>
-                <w:color w:val="FFFFFF"/>
-                <w:sz w:val="18"/>
-              </w:rPr>
-              <w:t>Couche</w:t>
-            </w:r>
-          </w:p>
-        </w:tc>
-        <w:tc>
-          <w:tcPr>
-            <w:tcW w:type="dxa" w:w="3096"/>
-            <w:shd w:fill="17212B"/>
-            <w:vAlign w:val="center"/>
-            <w:tcMar>
-              <w:top w:w="110" w:type="dxa"/>
-              <w:start w:w="120" w:type="dxa"/>
-              <w:bottom w:w="110" w:type="dxa"/>
-              <w:end w:w="120" w:type="dxa"/>
-            </w:tcMar>
-          </w:tcPr>
-          <w:p>
-            <w:pPr>
-              <w:jc w:val="left"/>
-            </w:pPr>
-            <w:r>
-              <w:rPr>
-                <w:rFonts w:ascii="Aptos" w:hAnsi="Aptos"/>
-                <w:b/>
-                <w:color w:val="FFFFFF"/>
-                <w:sz w:val="18"/>
-              </w:rPr>
-              <w:t>Technologies</w:t>
-            </w:r>
-          </w:p>
-        </w:tc>
-        <w:tc>
-          <w:tcPr>
-            <w:tcW w:type="dxa" w:w="5328"/>
-            <w:shd w:fill="17212B"/>
-            <w:vAlign w:val="center"/>
-            <w:tcMar>
-              <w:top w:w="110" w:type="dxa"/>
-              <w:start w:w="120" w:type="dxa"/>
-              <w:bottom w:w="110" w:type="dxa"/>
-              <w:end w:w="120" w:type="dxa"/>
-            </w:tcMar>
-          </w:tcPr>
-          <w:p>
-            <w:r>
-              <w:rPr>
-                <w:rFonts w:ascii="Aptos" w:hAnsi="Aptos" w:eastAsia="Aptos"/>
-                <w:b/>
-                <w:color w:val="FFFFFF"/>
-                <w:sz w:val="18"/>
-              </w:rPr>
-              <w:t>Rôle dans le projet</w:t>
-            </w:r>
-          </w:p>
-        </w:tc>
-      </w:tr>
-      <w:tr>
-        <w:trPr>
-          <w:cantSplit/>
-        </w:trPr>
-        <w:tc>
-          <w:tcPr>
-            <w:tcW w:type="dxa" w:w="1656"/>
-            <w:vAlign w:val="center"/>
-            <w:tcMar>
-              <w:top w:w="110" w:type="dxa"/>
-              <w:start w:w="120" w:type="dxa"/>
-              <w:bottom w:w="110" w:type="dxa"/>
-              <w:end w:w="120" w:type="dxa"/>
-            </w:tcMar>
-          </w:tcPr>
-          <w:p>
-            <w:pPr>
-              <w:spacing w:after="0"/>
-            </w:pPr>
-            <w:r>
-              <w:rPr>
-                <w:rFonts w:ascii="Aptos" w:hAnsi="Aptos"/>
-                <w:color w:val="000000"/>
-                <w:sz w:val="17"/>
-              </w:rPr>
-              <w:t>Interface</w:t>
-            </w:r>
-          </w:p>
-        </w:tc>
-        <w:tc>
-          <w:tcPr>
-            <w:tcW w:type="dxa" w:w="3096"/>
-            <w:vAlign w:val="center"/>
-            <w:tcMar>
-              <w:top w:w="110" w:type="dxa"/>
-              <w:start w:w="120" w:type="dxa"/>
-              <w:bottom w:w="110" w:type="dxa"/>
-              <w:end w:w="120" w:type="dxa"/>
-            </w:tcMar>
-          </w:tcPr>
-          <w:p>
-            <w:pPr>
-              <w:spacing w:after="0"/>
-            </w:pPr>
-            <w:r>
-              <w:rPr>
-                <w:rFonts w:ascii="Aptos" w:hAnsi="Aptos"/>
-                <w:color w:val="000000"/>
-                <w:sz w:val="17"/>
-              </w:rPr>
-              <w:t>Next.js 16.3.4, React 19, TypeScript 5.9</w:t>
-            </w:r>
-          </w:p>
-        </w:tc>
-        <w:tc>
-          <w:tcPr>
-            <w:tcW w:type="dxa" w:w="5328"/>
-            <w:vAlign w:val="center"/>
-            <w:tcMar>
-              <w:top w:w="110" w:type="dxa"/>
-              <w:start w:w="120" w:type="dxa"/>
-              <w:bottom w:w="110" w:type="dxa"/>
-              <w:end w:w="120" w:type="dxa"/>
-            </w:tcMar>
-          </w:tcPr>
-          <w:p>
-            <w:pPr>
-              <w:spacing w:after="0"/>
-            </w:pPr>
-            <w:r>
-              <w:rPr>
-                <w:rFonts w:ascii="Aptos" w:hAnsi="Aptos"/>
-                <w:color w:val="000000"/>
-                <w:sz w:val="17"/>
-              </w:rPr>
-              <w:t>Tableau de commandement, saisie libre, polling et débrief</w:t>
-            </w:r>
-          </w:p>
-        </w:tc>
-      </w:tr>
-      <w:tr>
-        <w:trPr>
-          <w:cantSplit/>
-        </w:trPr>
-        <w:tc>
-          <w:tcPr>
-            <w:tcW w:type="dxa" w:w="1656"/>
-            <w:vAlign w:val="center"/>
-            <w:tcMar>
-              <w:top w:w="110" w:type="dxa"/>
-              <w:start w:w="120" w:type="dxa"/>
-              <w:bottom w:w="110" w:type="dxa"/>
-              <w:end w:w="120" w:type="dxa"/>
-            </w:tcMar>
-            <w:shd w:fill="F7F9FA"/>
-          </w:tcPr>
-          <w:p>
-            <w:pPr>
-              <w:spacing w:after="0"/>
-            </w:pPr>
-            <w:r>
-              <w:rPr>
-                <w:rFonts w:ascii="Aptos" w:hAnsi="Aptos"/>
-                <w:color w:val="000000"/>
-                <w:sz w:val="17"/>
-              </w:rPr>
-              <w:t>Visualisation</w:t>
-            </w:r>
-          </w:p>
-        </w:tc>
-        <w:tc>
-          <w:tcPr>
-            <w:tcW w:type="dxa" w:w="3096"/>
-            <w:vAlign w:val="center"/>
-            <w:tcMar>
-              <w:top w:w="110" w:type="dxa"/>
-              <w:start w:w="120" w:type="dxa"/>
-              <w:bottom w:w="110" w:type="dxa"/>
-              <w:end w:w="120" w:type="dxa"/>
-            </w:tcMar>
-            <w:shd w:fill="F7F9FA"/>
-          </w:tcPr>
-          <w:p>
-            <w:pPr>
-              <w:spacing w:after="0"/>
-            </w:pPr>
-            <w:r>
-              <w:rPr>
-                <w:rFonts w:ascii="Aptos" w:hAnsi="Aptos"/>
-                <w:color w:val="000000"/>
-                <w:sz w:val="17"/>
-              </w:rPr>
-              <w:t>Three.js 0.185.1, React Three Fiber 9.7.0, Drei 10.7.8</w:t>
-            </w:r>
-          </w:p>
-        </w:tc>
-        <w:tc>
-          <w:tcPr>
-            <w:tcW w:type="dxa" w:w="5328"/>
-            <w:vAlign w:val="center"/>
-            <w:tcMar>
-              <w:top w:w="110" w:type="dxa"/>
-              <w:start w:w="120" w:type="dxa"/>
-              <w:bottom w:w="110" w:type="dxa"/>
-              <w:end w:w="120" w:type="dxa"/>
-            </w:tcMar>
-            <w:shd w:fill="F7F9FA"/>
-          </w:tcPr>
-          <w:p>
-            <w:pPr>
-              <w:spacing w:after="0"/>
-            </w:pPr>
-            <w:r>
-              <w:rPr>
-                <w:rFonts w:ascii="Aptos" w:hAnsi="Aptos"/>
-                <w:color w:val="000000"/>
-                <w:sz w:val="17"/>
-              </w:rPr>
-              <w:t>Bureau 3D low-poly, personnages et états visuels</w:t>
-            </w:r>
-          </w:p>
-        </w:tc>
-      </w:tr>
-      <w:tr>
-        <w:trPr>
-          <w:cantSplit/>
-        </w:trPr>
-        <w:tc>
-          <w:tcPr>
-            <w:tcW w:type="dxa" w:w="1656"/>
-            <w:vAlign w:val="center"/>
-            <w:tcMar>
-              <w:top w:w="110" w:type="dxa"/>
-              <w:start w:w="120" w:type="dxa"/>
-              <w:bottom w:w="110" w:type="dxa"/>
-              <w:end w:w="120" w:type="dxa"/>
-            </w:tcMar>
-          </w:tcPr>
-          <w:p>
-            <w:pPr>
-              <w:spacing w:after="0"/>
-            </w:pPr>
-            <w:r>
-              <w:rPr>
-                <w:rFonts w:ascii="Aptos" w:hAnsi="Aptos"/>
-                <w:color w:val="000000"/>
-                <w:sz w:val="17"/>
-              </w:rPr>
-              <w:t>API</w:t>
-            </w:r>
-          </w:p>
-        </w:tc>
-        <w:tc>
-          <w:tcPr>
-            <w:tcW w:type="dxa" w:w="3096"/>
-            <w:vAlign w:val="center"/>
-            <w:tcMar>
-              <w:top w:w="110" w:type="dxa"/>
-              <w:start w:w="120" w:type="dxa"/>
-              <w:bottom w:w="110" w:type="dxa"/>
-              <w:end w:w="120" w:type="dxa"/>
-            </w:tcMar>
-          </w:tcPr>
-          <w:p>
-            <w:pPr>
-              <w:spacing w:after="0"/>
-            </w:pPr>
-            <w:r>
-              <w:rPr>
-                <w:rFonts w:ascii="Aptos" w:hAnsi="Aptos"/>
-                <w:color w:val="000000"/>
-                <w:sz w:val="17"/>
-              </w:rPr>
-              <w:t>Python 3.12.13, FastAPI 0.141.1, Pydantic 2.13.5</w:t>
-            </w:r>
-          </w:p>
-        </w:tc>
-        <w:tc>
-          <w:tcPr>
-            <w:tcW w:type="dxa" w:w="5328"/>
-            <w:vAlign w:val="center"/>
-            <w:tcMar>
-              <w:top w:w="110" w:type="dxa"/>
-              <w:start w:w="120" w:type="dxa"/>
-              <w:bottom w:w="110" w:type="dxa"/>
-              <w:end w:w="120" w:type="dxa"/>
-            </w:tcMar>
-          </w:tcPr>
-          <w:p>
-            <w:pPr>
-              <w:spacing w:after="0"/>
-            </w:pPr>
-            <w:r>
-              <w:rPr>
-                <w:rFonts w:ascii="Aptos" w:hAnsi="Aptos"/>
-                <w:color w:val="000000"/>
-                <w:sz w:val="17"/>
-              </w:rPr>
-              <w:t>Contrats HTTP, validation et sérialisation</w:t>
-            </w:r>
-          </w:p>
-        </w:tc>
-      </w:tr>
-      <w:tr>
-        <w:trPr>
-          <w:cantSplit/>
-        </w:trPr>
-        <w:tc>
-          <w:tcPr>
-            <w:tcW w:type="dxa" w:w="1656"/>
-            <w:vAlign w:val="center"/>
-            <w:tcMar>
-              <w:top w:w="110" w:type="dxa"/>
-              <w:start w:w="120" w:type="dxa"/>
-              <w:bottom w:w="110" w:type="dxa"/>
-              <w:end w:w="120" w:type="dxa"/>
-            </w:tcMar>
-            <w:shd w:fill="F7F9FA"/>
-          </w:tcPr>
-          <w:p>
-            <w:pPr>
-              <w:spacing w:after="0"/>
-            </w:pPr>
-            <w:r>
-              <w:rPr>
-                <w:rFonts w:ascii="Aptos" w:hAnsi="Aptos"/>
-                <w:color w:val="000000"/>
-                <w:sz w:val="17"/>
-              </w:rPr>
-              <w:t>Orchestration</w:t>
-            </w:r>
-          </w:p>
-        </w:tc>
-        <w:tc>
-          <w:tcPr>
-            <w:tcW w:type="dxa" w:w="3096"/>
-            <w:vAlign w:val="center"/>
-            <w:tcMar>
-              <w:top w:w="110" w:type="dxa"/>
-              <w:start w:w="120" w:type="dxa"/>
-              <w:bottom w:w="110" w:type="dxa"/>
-              <w:end w:w="120" w:type="dxa"/>
-            </w:tcMar>
-            <w:shd w:fill="F7F9FA"/>
-          </w:tcPr>
-          <w:p>
-            <w:pPr>
-              <w:spacing w:after="0"/>
-            </w:pPr>
-            <w:r>
-              <w:rPr>
-                <w:rFonts w:ascii="Aptos" w:hAnsi="Aptos"/>
-                <w:color w:val="000000"/>
-                <w:sz w:val="17"/>
-              </w:rPr>
-              <w:t>LangGraph 1.2.11</w:t>
-            </w:r>
-          </w:p>
-        </w:tc>
-        <w:tc>
-          <w:tcPr>
-            <w:tcW w:type="dxa" w:w="5328"/>
-            <w:vAlign w:val="center"/>
-            <w:tcMar>
-              <w:top w:w="110" w:type="dxa"/>
-              <w:start w:w="120" w:type="dxa"/>
-              <w:bottom w:w="110" w:type="dxa"/>
-              <w:end w:w="120" w:type="dxa"/>
-            </w:tcMar>
-            <w:shd w:fill="F7F9FA"/>
-          </w:tcPr>
-          <w:p>
-            <w:pPr>
-              <w:spacing w:after="0"/>
-            </w:pPr>
-            <w:r>
-              <w:rPr>
-                <w:rFonts w:ascii="Aptos" w:hAnsi="Aptos"/>
-                <w:color w:val="000000"/>
-                <w:sz w:val="17"/>
-              </w:rPr>
-              <w:t>Interruptions, reprise, distribution Send et deux rondes maximum</w:t>
-            </w:r>
-          </w:p>
-        </w:tc>
-      </w:tr>
-      <w:tr>
-        <w:trPr>
-          <w:cantSplit/>
-        </w:trPr>
-        <w:tc>
-          <w:tcPr>
-            <w:tcW w:type="dxa" w:w="1656"/>
-            <w:vAlign w:val="center"/>
-            <w:tcMar>
-              <w:top w:w="110" w:type="dxa"/>
-              <w:start w:w="120" w:type="dxa"/>
-              <w:bottom w:w="110" w:type="dxa"/>
-              <w:end w:w="120" w:type="dxa"/>
-            </w:tcMar>
-          </w:tcPr>
-          <w:p>
-            <w:pPr>
-              <w:spacing w:after="0"/>
-            </w:pPr>
-            <w:r>
-              <w:rPr>
-                <w:rFonts w:ascii="Aptos" w:hAnsi="Aptos"/>
-                <w:color w:val="000000"/>
-                <w:sz w:val="17"/>
-              </w:rPr>
-              <w:t>Agents</w:t>
-            </w:r>
-          </w:p>
-        </w:tc>
-        <w:tc>
-          <w:tcPr>
-            <w:tcW w:type="dxa" w:w="3096"/>
-            <w:vAlign w:val="center"/>
-            <w:tcMar>
-              <w:top w:w="110" w:type="dxa"/>
-              <w:start w:w="120" w:type="dxa"/>
-              <w:bottom w:w="110" w:type="dxa"/>
-              <w:end w:w="120" w:type="dxa"/>
-            </w:tcMar>
-          </w:tcPr>
-          <w:p>
-            <w:pPr>
-              <w:spacing w:after="0"/>
-            </w:pPr>
-            <w:r>
-              <w:rPr>
-                <w:rFonts w:ascii="Aptos" w:hAnsi="Aptos"/>
-                <w:color w:val="000000"/>
-                <w:sz w:val="17"/>
-              </w:rPr>
-              <w:t>LangChain 1.3.18, OpenAI GPT-5.6 Luna</w:t>
-            </w:r>
-          </w:p>
-        </w:tc>
-        <w:tc>
-          <w:tcPr>
-            <w:tcW w:type="dxa" w:w="5328"/>
-            <w:vAlign w:val="center"/>
-            <w:tcMar>
-              <w:top w:w="110" w:type="dxa"/>
-              <w:start w:w="120" w:type="dxa"/>
-              <w:bottom w:w="110" w:type="dxa"/>
-              <w:end w:w="120" w:type="dxa"/>
-            </w:tcMar>
-          </w:tcPr>
-          <w:p>
-            <w:pPr>
-              <w:spacing w:after="0"/>
-            </w:pPr>
-            <w:r>
-              <w:rPr>
-                <w:rFonts w:ascii="Aptos" w:hAnsi="Aptos"/>
-                <w:color w:val="000000"/>
-                <w:sz w:val="17"/>
-              </w:rPr>
-              <w:t>Intentions structurées, répliques, raisons et émotions des quatre personnages</w:t>
-            </w:r>
-          </w:p>
-        </w:tc>
-      </w:tr>
-      <w:tr>
-        <w:trPr>
-          <w:cantSplit/>
-        </w:trPr>
-        <w:tc>
-          <w:tcPr>
-            <w:tcW w:type="dxa" w:w="1656"/>
-            <w:vAlign w:val="center"/>
-            <w:tcMar>
-              <w:top w:w="110" w:type="dxa"/>
-              <w:start w:w="120" w:type="dxa"/>
-              <w:bottom w:w="110" w:type="dxa"/>
-              <w:end w:w="120" w:type="dxa"/>
-            </w:tcMar>
-            <w:shd w:fill="F7F9FA"/>
-          </w:tcPr>
-          <w:p>
-            <w:pPr>
-              <w:spacing w:after="0"/>
-            </w:pPr>
-            <w:r>
-              <w:rPr>
-                <w:rFonts w:ascii="Aptos" w:hAnsi="Aptos"/>
-                <w:color w:val="000000"/>
-                <w:sz w:val="17"/>
-              </w:rPr>
-              <w:t>Persistance</w:t>
-            </w:r>
-          </w:p>
-        </w:tc>
-        <w:tc>
-          <w:tcPr>
-            <w:tcW w:type="dxa" w:w="3096"/>
-            <w:vAlign w:val="center"/>
-            <w:tcMar>
-              <w:top w:w="110" w:type="dxa"/>
-              <w:start w:w="120" w:type="dxa"/>
-              <w:bottom w:w="110" w:type="dxa"/>
-              <w:end w:w="120" w:type="dxa"/>
-            </w:tcMar>
-            <w:shd w:fill="F7F9FA"/>
-          </w:tcPr>
-          <w:p>
-            <w:pPr>
-              <w:spacing w:after="0"/>
-            </w:pPr>
-            <w:r>
-              <w:rPr>
-                <w:rFonts w:ascii="Aptos" w:hAnsi="Aptos"/>
-                <w:color w:val="000000"/>
-                <w:sz w:val="17"/>
-              </w:rPr>
-              <w:t>SQLite et checkpointer LangGraph</w:t>
-            </w:r>
-          </w:p>
-        </w:tc>
-        <w:tc>
-          <w:tcPr>
-            <w:tcW w:type="dxa" w:w="5328"/>
-            <w:vAlign w:val="center"/>
-            <w:tcMar>
-              <w:top w:w="110" w:type="dxa"/>
-              <w:start w:w="120" w:type="dxa"/>
-              <w:bottom w:w="110" w:type="dxa"/>
-              <w:end w:w="120" w:type="dxa"/>
-            </w:tcMar>
-            <w:shd w:fill="F7F9FA"/>
-          </w:tcPr>
-          <w:p>
-            <w:pPr>
-              <w:spacing w:after="0"/>
-            </w:pPr>
-            <w:r>
-              <w:rPr>
-                <w:rFonts w:ascii="Aptos" w:hAnsi="Aptos"/>
-                <w:color w:val="000000"/>
-                <w:sz w:val="17"/>
-              </w:rPr>
-              <w:t>État canonique, événements, reprise et idempotence</w:t>
-            </w:r>
-          </w:p>
-        </w:tc>
-      </w:tr>
-      <w:tr>
-        <w:trPr>
-          <w:cantSplit/>
-        </w:trPr>
-        <w:tc>
-          <w:tcPr>
-            <w:tcW w:type="dxa" w:w="1656"/>
-            <w:vAlign w:val="center"/>
-            <w:tcMar>
-              <w:top w:w="110" w:type="dxa"/>
-              <w:start w:w="120" w:type="dxa"/>
-              <w:bottom w:w="110" w:type="dxa"/>
-              <w:end w:w="120" w:type="dxa"/>
-            </w:tcMar>
-          </w:tcPr>
-          <w:p>
-            <w:pPr>
-              <w:spacing w:after="0"/>
-            </w:pPr>
-            <w:r>
-              <w:rPr>
-                <w:rFonts w:ascii="Aptos" w:hAnsi="Aptos"/>
-                <w:color w:val="000000"/>
-                <w:sz w:val="17"/>
-              </w:rPr>
-              <w:t>Fiabilité</w:t>
-            </w:r>
-          </w:p>
-        </w:tc>
-        <w:tc>
-          <w:tcPr>
-            <w:tcW w:type="dxa" w:w="3096"/>
-            <w:vAlign w:val="center"/>
-            <w:tcMar>
-              <w:top w:w="110" w:type="dxa"/>
-              <w:start w:w="120" w:type="dxa"/>
-              <w:bottom w:w="110" w:type="dxa"/>
-              <w:end w:w="120" w:type="dxa"/>
-            </w:tcMar>
-          </w:tcPr>
-          <w:p>
-            <w:pPr>
-              <w:spacing w:after="0"/>
-            </w:pPr>
-            <w:r>
-              <w:rPr>
-                <w:rFonts w:ascii="Aptos" w:hAnsi="Aptos"/>
-                <w:color w:val="000000"/>
-                <w:sz w:val="17"/>
-              </w:rPr>
-              <w:t>Pydantic, règles métier et reprise explicite</w:t>
-            </w:r>
-          </w:p>
-        </w:tc>
-        <w:tc>
-          <w:tcPr>
-            <w:tcW w:type="dxa" w:w="5328"/>
-            <w:vAlign w:val="center"/>
-            <w:tcMar>
-              <w:top w:w="110" w:type="dxa"/>
-              <w:start w:w="120" w:type="dxa"/>
-              <w:bottom w:w="110" w:type="dxa"/>
-              <w:end w:w="120" w:type="dxa"/>
-            </w:tcMar>
-          </w:tcPr>
-          <w:p>
-            <w:pPr>
-              <w:spacing w:after="0"/>
-            </w:pPr>
-            <w:r>
-              <w:rPr>
-                <w:rFonts w:ascii="Aptos" w:hAnsi="Aptos"/>
-                <w:color w:val="000000"/>
-                <w:sz w:val="17"/>
-              </w:rPr>
-              <w:t>Validation des sorties, effets contrôlés et reprise après échec</w:t>
-            </w:r>
-          </w:p>
-        </w:tc>
-      </w:tr>
-    </w:tbl>
-    <w:p>
-      <w:pPr>
-        <w:spacing w:after="0"/>
-      </w:pPr>
-    </w:p>
-    <w:p>
-      <w:r>
-        <w:br w:type="page"/>
-      </w:r>
-    </w:p>
-    <w:p>
-      <w:pPr>
-        <w:pStyle w:val="Heading1"/>
-      </w:pPr>
-      <w:r>
-        <w:t>4  Graphe d'orchestration LangGraph</w:t>
-      </w:r>
-    </w:p>
-    <w:p>
-      <w:r>
-        <w:t>Le graphe ci-dessous représente le cycle réellement implémenté. Il montre les deux interruptions possibles, la distribution parallèle des personnages, la seconde ronde conditionnelle, la finalisation unique du tour et la persistance de l'état.</w:t>
-      </w:r>
-    </w:p>
-    <w:p>
-      <w:pPr>
-        <w:spacing w:before="80" w:after="0"/>
-        <w:jc w:val="center"/>
-      </w:pPr>
-      <w:r>
-        <w:drawing>
-          <wp:inline xmlns:a="http://schemas.openxmlformats.org/drawingml/2006/main" xmlns:pic="http://schemas.openxmlformats.org/drawingml/2006/picture">
-            <wp:extent cx="5486400" cy="7010400"/>
-            <wp:docPr id="5" name="Picture 5" descr="Graphe LangGraph complet de Project Meltdown avec interruptions, distribution parallèle, boucles et persistance."/>
-            <wp:cNvGraphicFramePr>
-              <a:graphicFrameLocks noChangeAspect="1"/>
-            </wp:cNvGraphicFramePr>
-            <a:graphic>
-              <a:graphicData uri="http://schemas.openxmlformats.org/drawingml/2006/picture">
-                <pic:pic>
-                  <pic:nvPicPr>
-                    <pic:cNvPr id="0" name="graphe-langgraph-complet.png"/>
-                    <pic:cNvPicPr/>
-                  </pic:nvPicPr>
-                  <pic:blipFill>
-                    <a:blip r:embed="rId22"/>
-                    <a:stretch>
-                      <a:fillRect/>
-                    </a:stretch>
-                  </pic:blipFill>
-                  <pic:spPr>
-                    <a:xfrm>
-                      <a:off x="0" y="0"/>
-                      <a:ext cx="5486400" cy="7010400"/>
-                    </a:xfrm>
-                    <a:prstGeom prst="rect"/>
-                  </pic:spPr>
-                </pic:pic>
-              </a:graphicData>
-            </a:graphic>
-          </wp:inline>
-        </w:drawing>
-      </w:r>
-    </w:p>
-    <w:p>
-      <w:pPr>
-        <w:spacing w:before="60" w:after="120"/>
-        <w:jc w:val="center"/>
-      </w:pPr>
-      <w:r>
-        <w:rPr>
-          <w:i/>
-          <w:color w:val="526170"/>
-          <w:sz w:val="17"/>
-        </w:rPr>
-        <w:t>Figure 4 - Graphe d'exécution complet d'un tour de Project Meltdown.</w:t>
-      </w:r>
-    </w:p>
-    <w:p>
-      <w:r>
-        <w:br w:type="page"/>
-      </w:r>
-    </w:p>
-    <w:p>
-      <w:pPr>
-        <w:pStyle w:val="Heading1"/>
-        <w:keepNext/>
-      </w:pPr>
-      <w:r>
-        <w:t>5 Méthodologie de conception</w:t>
-      </w:r>
-    </w:p>
-    <w:p>
-      <w:pPr>
-        <w:pStyle w:val="Heading2"/>
-      </w:pPr>
-      <w:r>
-        <w:t>Construction par versions jouables</w:t>
-      </w:r>
-    </w:p>
-    <w:p>
-      <w:pPr>
-        <w:widowControl/>
-      </w:pPr>
-      <w:r>
-        <w:t>J'ai construit le projet seul par incréments fonctionnels : cadrage du scénario, moteur métier, orchestration multi-agent, interaction naturelle, puis mise en scène 3D. Chaque étape produisait une version jouable et observable avant l'ajout de la suivante. La validation finale a consisté à parcourir le produit complet dans un navigateur, du briefing au débrief.</w:t>
-      </w:r>
-    </w:p>
-    <w:p>
-      <w:pPr>
-        <w:pStyle w:val="ListNumber"/>
-        <w:spacing w:after="100"/>
-      </w:pPr>
-      <w:r>
-        <w:t>Cadrer l'objectif pédagogique et écrire l'arbre de décision ainsi que le graphe d'orchestration.</w:t>
-      </w:r>
-    </w:p>
-    <w:p>
-      <w:pPr>
-        <w:pStyle w:val="ListNumber"/>
-        <w:spacing w:after="100"/>
-      </w:pPr>
-      <w:r>
-        <w:t>Construire le moteur déterministe, l'API, la persistance et le premier tableau de bord.</w:t>
-      </w:r>
-    </w:p>
-    <w:p>
-      <w:pPr>
-        <w:pStyle w:val="ListNumber"/>
-        <w:spacing w:after="100"/>
-      </w:pPr>
-      <w:r>
-        <w:t>Ajouter l'interprétation des consignes naturelles, les pauses pour questions et la reprise d'une ronde.</w:t>
-      </w:r>
-    </w:p>
-    <w:p>
-      <w:pPr>
-        <w:pStyle w:val="ListNumber"/>
-        <w:spacing w:after="100"/>
-      </w:pPr>
-      <w:r>
-        <w:t>Calibrer le modèle sur huit situations, corriger les contextes ambigus puis retirer le secours silencieux afin que toute erreur persistante reste visible et récupérable.</w:t>
-      </w:r>
-    </w:p>
-    <w:p>
-      <w:pPr>
-        <w:pStyle w:val="ListNumber"/>
-        <w:spacing w:after="100"/>
-      </w:pPr>
-      <w:r>
-        <w:t>Intégrer le bureau 3D, l'accessibilité clavier, le mouvement réduit et le fallback 2D.</w:t>
-      </w:r>
-    </w:p>
-    <w:p>
-      <w:pPr>
-        <w:pStyle w:val="ListNumber"/>
-        <w:spacing w:after="100"/>
-      </w:pPr>
-      <w:r>
-        <w:t>Relier la chronologie, le débrief et les écrans 3D aux mêmes événements persistés.</w:t>
-      </w:r>
-    </w:p>
-    <w:p>
-      <w:pPr>
-        <w:pStyle w:val="Heading2"/>
-      </w:pPr>
-      <w:r>
-        <w:t>Approche d'apprentissage</w:t>
-      </w:r>
-    </w:p>
-    <w:p>
-      <w:pPr>
-        <w:widowControl/>
-      </w:pPr>
-      <w:r>
-        <w:t>Pour construire la dimension pédagogique, je me suis appuyé sur l'apprentissage par l'action : le joueur décide, observe les conséquences, comprend ses arbitrages puis peut essayer une autre stratégie. Cette logique est traduite dans le produit de la manière suivante :</w:t>
-      </w:r>
-    </w:p>
-    <w:tbl>
-      <w:tblPr>
-        <w:tblStyle w:val="TableGrid"/>
-        <w:tblW w:type="auto" w:w="0"/>
-        <w:jc w:val="center"/>
-        <w:tblLayout w:type="fixed"/>
-        <w:tblLook w:firstColumn="1" w:firstRow="1" w:lastColumn="0" w:lastRow="0" w:noHBand="0" w:noVBand="1" w:val="04A0"/>
-        <w:tblBorders>
-          <w:top w:val="single" w:sz="5" w:color="D9D9D9"/>
-          <w:left w:val="single" w:sz="5" w:color="D9D9D9"/>
-          <w:bottom w:val="single" w:sz="5" w:color="D9D9D9"/>
-          <w:right w:val="single" w:sz="5" w:color="D9D9D9"/>
-          <w:insideH w:val="single" w:sz="5" w:color="D9D9D9"/>
-          <w:insideV w:val="single" w:sz="5" w:color="D9D9D9"/>
-        </w:tblBorders>
-      </w:tblPr>
-      <w:tblGrid>
-        <w:gridCol w:w="5083"/>
-        <w:gridCol w:w="5083"/>
-      </w:tblGrid>
-      <w:tr>
-        <w:trPr>
-          <w:tblHeader w:val="true"/>
-          <w:cantSplit/>
-        </w:trPr>
-        <w:tc>
-          <w:tcPr>
-            <w:tcW w:type="dxa" w:w="2880"/>
-            <w:shd w:fill="17212B"/>
-            <w:vAlign w:val="center"/>
-            <w:tcMar>
-              <w:top w:w="110" w:type="dxa"/>
-              <w:start w:w="120" w:type="dxa"/>
-              <w:bottom w:w="110" w:type="dxa"/>
-              <w:end w:w="120" w:type="dxa"/>
-            </w:tcMar>
-          </w:tcPr>
-          <w:p>
-            <w:pPr>
-              <w:jc w:val="left"/>
-            </w:pPr>
-            <w:r>
-              <w:rPr>
-                <w:rFonts w:ascii="Aptos" w:hAnsi="Aptos"/>
-                <w:b/>
-                <w:color w:val="FFFFFF"/>
-                <w:sz w:val="18"/>
-              </w:rPr>
-              <w:t>Étape pédagogique</w:t>
-            </w:r>
-          </w:p>
-        </w:tc>
-        <w:tc>
-          <w:tcPr>
-            <w:tcW w:type="dxa" w:w="7200"/>
-            <w:shd w:fill="17212B"/>
-            <w:vAlign w:val="center"/>
-            <w:tcMar>
-              <w:top w:w="110" w:type="dxa"/>
-              <w:start w:w="120" w:type="dxa"/>
-              <w:bottom w:w="110" w:type="dxa"/>
-              <w:end w:w="120" w:type="dxa"/>
-            </w:tcMar>
-          </w:tcPr>
-          <w:p>
-            <w:pPr>
-              <w:jc w:val="left"/>
-            </w:pPr>
-            <w:r>
-              <w:rPr>
-                <w:rFonts w:ascii="Aptos" w:hAnsi="Aptos"/>
-                <w:b/>
-                <w:color w:val="FFFFFF"/>
-                <w:sz w:val="18"/>
-              </w:rPr>
-              <w:t>Traduction dans le jeu</w:t>
-            </w:r>
-          </w:p>
-        </w:tc>
-      </w:tr>
-      <w:tr>
-        <w:trPr>
-          <w:cantSplit/>
-        </w:trPr>
-        <w:tc>
-          <w:tcPr>
-            <w:tcW w:type="dxa" w:w="2880"/>
-            <w:vAlign w:val="center"/>
-            <w:tcMar>
-              <w:top w:w="110" w:type="dxa"/>
-              <w:start w:w="120" w:type="dxa"/>
-              <w:bottom w:w="110" w:type="dxa"/>
-              <w:end w:w="120" w:type="dxa"/>
-            </w:tcMar>
-          </w:tcPr>
-          <w:p>
-            <w:pPr>
-              <w:spacing w:after="0"/>
-            </w:pPr>
-            <w:r>
-              <w:rPr>
-                <w:rFonts w:ascii="Aptos" w:hAnsi="Aptos"/>
-                <w:color w:val="000000"/>
-                <w:sz w:val="17"/>
-              </w:rPr>
-              <w:t>Expérience concrète</w:t>
-            </w:r>
-          </w:p>
-        </w:tc>
-        <w:tc>
-          <w:tcPr>
-            <w:tcW w:type="dxa" w:w="7200"/>
-            <w:vAlign w:val="center"/>
-            <w:tcMar>
-              <w:top w:w="110" w:type="dxa"/>
-              <w:start w:w="120" w:type="dxa"/>
-              <w:bottom w:w="110" w:type="dxa"/>
-              <w:end w:w="120" w:type="dxa"/>
-            </w:tcMar>
-          </w:tcPr>
-          <w:p>
-            <w:r>
-              <w:t>Prendre une décision dans une crise courte avec des ressources limitées.</w:t>
-            </w:r>
-          </w:p>
-        </w:tc>
-      </w:tr>
-      <w:tr>
-        <w:trPr>
-          <w:cantSplit/>
-        </w:trPr>
-        <w:tc>
-          <w:tcPr>
-            <w:tcW w:type="dxa" w:w="2880"/>
-            <w:vAlign w:val="center"/>
-            <w:tcMar>
-              <w:top w:w="110" w:type="dxa"/>
-              <w:start w:w="120" w:type="dxa"/>
-              <w:bottom w:w="110" w:type="dxa"/>
-              <w:end w:w="120" w:type="dxa"/>
-            </w:tcMar>
-            <w:shd w:fill="F7F9FA"/>
-          </w:tcPr>
-          <w:p>
-            <w:pPr>
-              <w:spacing w:after="0"/>
-            </w:pPr>
-            <w:r>
-              <w:rPr>
-                <w:rFonts w:ascii="Aptos" w:hAnsi="Aptos"/>
-                <w:color w:val="000000"/>
-                <w:sz w:val="17"/>
-              </w:rPr>
-              <w:t>Observation réflexive</w:t>
-            </w:r>
-          </w:p>
-        </w:tc>
-        <w:tc>
-          <w:tcPr>
-            <w:tcW w:type="dxa" w:w="7200"/>
-            <w:vAlign w:val="center"/>
-            <w:tcMar>
-              <w:top w:w="110" w:type="dxa"/>
-              <w:start w:w="120" w:type="dxa"/>
-              <w:bottom w:w="110" w:type="dxa"/>
-              <w:end w:w="120" w:type="dxa"/>
-            </w:tcMar>
-            <w:shd w:fill="F7F9FA"/>
-          </w:tcPr>
-          <w:p>
-            <w:r>
-              <w:t>Observer les réactions, les métriques et la chronologie causale du tour.</w:t>
-            </w:r>
-          </w:p>
-        </w:tc>
-      </w:tr>
-      <w:tr>
-        <w:trPr>
-          <w:cantSplit/>
-        </w:trPr>
-        <w:tc>
-          <w:tcPr>
-            <w:tcW w:type="dxa" w:w="2880"/>
-            <w:vAlign w:val="center"/>
-            <w:tcMar>
-              <w:top w:w="110" w:type="dxa"/>
-              <w:start w:w="120" w:type="dxa"/>
-              <w:bottom w:w="110" w:type="dxa"/>
-              <w:end w:w="120" w:type="dxa"/>
-            </w:tcMar>
-          </w:tcPr>
-          <w:p>
-            <w:pPr>
-              <w:spacing w:after="0"/>
-            </w:pPr>
-            <w:r>
-              <w:rPr>
-                <w:rFonts w:ascii="Aptos" w:hAnsi="Aptos"/>
-                <w:color w:val="000000"/>
-                <w:sz w:val="17"/>
-              </w:rPr>
-              <w:t>Conceptualisation</w:t>
-            </w:r>
-          </w:p>
-        </w:tc>
-        <w:tc>
-          <w:tcPr>
-            <w:tcW w:type="dxa" w:w="7200"/>
-            <w:vAlign w:val="center"/>
-            <w:tcMar>
-              <w:top w:w="110" w:type="dxa"/>
-              <w:start w:w="120" w:type="dxa"/>
-              <w:bottom w:w="110" w:type="dxa"/>
-              <w:end w:w="120" w:type="dxa"/>
-            </w:tcMar>
-          </w:tcPr>
-          <w:p>
-            <w:r>
-              <w:t>Relier les arbitrages entre périmètre, sécurité et équipe.</w:t>
-            </w:r>
-          </w:p>
-        </w:tc>
-      </w:tr>
-      <w:tr>
-        <w:trPr>
-          <w:cantSplit/>
-        </w:trPr>
-        <w:tc>
-          <w:tcPr>
-            <w:tcW w:type="dxa" w:w="2880"/>
-            <w:vAlign w:val="center"/>
-            <w:tcMar>
-              <w:top w:w="110" w:type="dxa"/>
-              <w:start w:w="120" w:type="dxa"/>
-              <w:bottom w:w="110" w:type="dxa"/>
-              <w:end w:w="120" w:type="dxa"/>
-            </w:tcMar>
-            <w:shd w:fill="F7F9FA"/>
-          </w:tcPr>
-          <w:p>
-            <w:pPr>
-              <w:spacing w:after="0"/>
-            </w:pPr>
-            <w:r>
-              <w:rPr>
-                <w:rFonts w:ascii="Aptos" w:hAnsi="Aptos"/>
-                <w:color w:val="000000"/>
-                <w:sz w:val="17"/>
-              </w:rPr>
-              <w:t>Expérimentation active</w:t>
-            </w:r>
-          </w:p>
-        </w:tc>
-        <w:tc>
-          <w:tcPr>
-            <w:tcW w:type="dxa" w:w="7200"/>
-            <w:vAlign w:val="center"/>
-            <w:tcMar>
-              <w:top w:w="110" w:type="dxa"/>
-              <w:start w:w="120" w:type="dxa"/>
-              <w:bottom w:w="110" w:type="dxa"/>
-              <w:end w:w="120" w:type="dxa"/>
-            </w:tcMar>
-            <w:shd w:fill="F7F9FA"/>
-          </w:tcPr>
-          <w:p>
-            <w:r>
-              <w:t>Rejouer la crise en essayant une autre stratégie.</w:t>
-            </w:r>
-          </w:p>
-        </w:tc>
-      </w:tr>
-    </w:tbl>
-    <w:p>
-      <w:pPr>
-        <w:spacing w:after="0"/>
-      </w:pPr>
-    </w:p>
-    <w:p>
-      <w:pPr>
-        <w:widowControl/>
-      </w:pPr>
-      <w:r>
-        <w:t>Je me suis également appuyé sur une boucle courte entre décision, action et retour, ainsi que sur un débrief relié aux événements réels de la partie. Chaque conséquence reste ainsi compréhensible et utile pour progresser.</w:t>
-      </w:r>
-    </w:p>
-    <w:p>
-      <w:pPr>
-        <w:pStyle w:val="Heading2"/>
-      </w:pPr>
-      <w:r>
-        <w:t>Contrôle de l'IA</w:t>
-      </w:r>
-    </w:p>
-    <w:p>
-      <w:pPr>
-        <w:pStyle w:val="ListBullet"/>
-        <w:spacing w:after="80"/>
-        <w:ind w:left="317" w:hanging="202"/>
-      </w:pPr>
-      <w:r>
-        <w:t>Le modèle ne reçoit que les faits connus par son personnage et une liste d'actions autorisées.</w:t>
-      </w:r>
-    </w:p>
-    <w:p>
-      <w:pPr>
-        <w:pStyle w:val="ListBullet"/>
-        <w:spacing w:after="80"/>
-        <w:ind w:left="317" w:hanging="202"/>
-      </w:pPr>
-      <w:r>
-        <w:t>La sortie est structurée et revalidée par Pydantic et par les règles métier.</w:t>
-      </w:r>
-    </w:p>
-    <w:p>
-      <w:pPr>
-        <w:pStyle w:val="ListBullet"/>
-        <w:spacing w:after="80"/>
-        <w:ind w:left="317" w:hanging="202"/>
-      </w:pPr>
-      <w:r>
-        <w:t>Une sortie invalide ou une erreur persistante interrompt la ronde dans un état sauvegardé ; le joueur peut reprendre explicitement la même ronde avec « Retry safely ».</w:t>
-      </w:r>
-    </w:p>
-    <w:p>
-      <w:pPr>
-        <w:pStyle w:val="ListBullet"/>
-        <w:spacing w:after="80"/>
-        <w:ind w:left="317" w:hanging="202"/>
-      </w:pPr>
-      <w:r>
-        <w:t>Les conséquences et les métriques sont calculées par le moteur, jamais directement par le LLM.</w:t>
-      </w:r>
-    </w:p>
-    <w:p>
-      <w:pPr>
-        <w:pStyle w:val="ListBullet"/>
-        <w:spacing w:after="80"/>
-        <w:ind w:left="317" w:hanging="202"/>
-      </w:pPr>
-      <w:r>
-        <w:t>Le coach final sélectionne des événements déjà rédigés ; chaque référence est vérifiée.</w:t>
-      </w:r>
-    </w:p>
-    <w:p>
-      <w:pPr>
-        <w:widowControl/>
-      </w:pPr>
-      <w:r>
-        <w:t>Le runtime requiert un modèle configuré. Le choix local est openai:gpt-5.6-luna avec un effort de raisonnement none, 384 tokens de sortie maximum, un timeout de 20 secondes et une relance fournisseur. Il n'existe plus de mode de personnages à règles ni de secours silencieux.</w:t>
-      </w:r>
-    </w:p>
-    <w:p>
-      <w:r>
-        <w:br w:type="page"/>
-      </w:r>
-    </w:p>
-    <w:p>
-      <w:pPr>
-        <w:pStyle w:val="Heading1"/>
-        <w:keepNext/>
-      </w:pPr>
-      <w:r>
-        <w:t>6 Résultat démontré</w:t>
-      </w:r>
-    </w:p>
-    <w:p>
-      <w:pPr>
-        <w:widowControl/>
-      </w:pPr>
-      <w:r>
-        <w:t>Le produit couvre une boucle complète : briefing, consigne naturelle, interprétation visible, réponses des agents, progression persistée, livraison et débrief causal. Les cinq captures de ce rapport montrent ces étapes dans le prototype en fonctionnement.</w:t>
-      </w:r>
-    </w:p>
-    <w:p>
-      <w:pPr>
-        <w:pStyle w:val="Heading2"/>
-      </w:pPr>
-      <w:r>
-        <w:t>Validation dans le navigateur</w:t>
-      </w:r>
-    </w:p>
-    <w:p>
-      <w:pPr/>
-      <w:r>
-        <w:t>Le 5 septembre 2026, une partie complète a été jouée dans l'interface avec le modèle configuré. La livraison a abouti au cinquième tour avec 100 % de progression, un budget de 34/100, une confiance client de 73/100, un moral de 60/100 et une sécurité vérifiée.</w:t>
-      </w:r>
-    </w:p>
-    <w:p>
-      <w:pPr/>
-      <w:r>
-        <w:t>Une consigne volontairement vague a d'abord été refusée sans consommer le tour. Au quatrième tour, une sortie non conforme au schéma Pydantic a interrompu la ronde. L'état est resté sauvegardé et le bouton « Retry safely » a repris la même ronde sans doubler le temps ni les coûts. La seconde tentative a réussi, ce qui démontre la reprise prévue par le produit.</w:t>
-      </w:r>
-    </w:p>
-    <w:p>
-      <w:pPr/>
-      <w:r>
-        <w:t>Deux vues dédiées rendent désormais les mécanismes internes directement exploitables dans un rapport : l'une rassemble les réponses contextualisées des personnages ; l'autre expose la chaîne d'orchestration et sa trace d'exécution.</w:t>
-      </w:r>
-    </w:p>
-    <w:p>
-      <w:pPr>
-        <w:jc w:val="center"/>
-      </w:pPr>
-      <w:r>
-        <w:br w:type="page"/>
-      </w:r>
-      <w:r>
-        <w:drawing>
-          <wp:inline xmlns:a="http://schemas.openxmlformats.org/drawingml/2006/main" xmlns:pic="http://schemas.openxmlformats.org/drawingml/2006/picture">
-            <wp:extent cx="5806440" cy="5721468"/>
-            <wp:docPr id="6" name="Picture 6" title="Réponses des agents" descr="Quatre cartes montrent les réponses, émotions et raisons d’Alex, Camille, Sam et Morgan."/>
-            <wp:cNvGraphicFramePr>
-              <a:graphicFrameLocks noChangeAspect="1"/>
-            </wp:cNvGraphicFramePr>
-            <a:graphic>
-              <a:graphicData uri="http://schemas.openxmlformats.org/drawingml/2006/picture">
-                <pic:pic>
-                  <pic:nvPicPr>
-                    <pic:cNvPr id="0" name="jeu-agents.png"/>
-                    <pic:cNvPicPr/>
-                  </pic:nvPicPr>
-                  <pic:blipFill>
-                    <a:blip r:embed="rId24"/>
-                    <a:stretch>
-                      <a:fillRect/>
-                    </a:stretch>
-                  </pic:blipFill>
-                  <pic:spPr>
-                    <a:xfrm>
-                      <a:off x="0" y="0"/>
-                      <a:ext cx="5806440" cy="5721468"/>
-                    </a:xfrm>
-                    <a:prstGeom prst="rect"/>
-                  </pic:spPr>
-                </pic:pic>
-              </a:graphicData>
-            </a:graphic>
-          </wp:inline>
-        </w:drawing>
-      </w:r>
-    </w:p>
-    <w:p>
-      <w:pPr>
-        <w:jc w:val="center"/>
-      </w:pPr>
-      <w:r>
-        <w:t>Figure 5 - Réponses contextualisées des quatre agents : rôle, émotion, parole, justification et effets visibles. Source : prototype (jeu-agents.png).</w:t>
-      </w:r>
-    </w:p>
-    <w:p>
-      <w:pPr/>
-      <w:r>
-        <w:t>Une partie de capture complémentaire a produit deux rondes et sept activations au premier tour. Cette trace illustre la distribution réelle des personnages sans exposer leurs connaissances privées.</w:t>
-      </w:r>
-    </w:p>
-    <w:p>
-      <w:pPr>
-        <w:jc w:val="center"/>
-      </w:pPr>
-      <w:r>
-        <w:br w:type="page"/>
-      </w:r>
-      <w:r>
-        <w:drawing>
-          <wp:inline xmlns:a="http://schemas.openxmlformats.org/drawingml/2006/main" xmlns:pic="http://schemas.openxmlformats.org/drawingml/2006/picture">
-            <wp:extent cx="6172200" cy="5411966"/>
-            <wp:docPr id="7" name="Picture 7" title="Orchestration multi-agent" descr="Pipeline décision, interprétation, agents, règles et sauvegarde, avec deux rondes et sept activations."/>
-            <wp:cNvGraphicFramePr>
-              <a:graphicFrameLocks noChangeAspect="1"/>
-            </wp:cNvGraphicFramePr>
-            <a:graphic>
-              <a:graphicData uri="http://schemas.openxmlformats.org/drawingml/2006/picture">
-                <pic:pic>
-                  <pic:nvPicPr>
-                    <pic:cNvPr id="0" name="jeu-orchestration.png"/>
-                    <pic:cNvPicPr/>
-                  </pic:nvPicPr>
-                  <pic:blipFill>
-                    <a:blip r:embed="rId25"/>
-                    <a:stretch>
-                      <a:fillRect/>
-                    </a:stretch>
-                  </pic:blipFill>
-                  <pic:spPr>
-                    <a:xfrm>
-                      <a:off x="0" y="0"/>
-                      <a:ext cx="6172200" cy="5411966"/>
-                    </a:xfrm>
-                    <a:prstGeom prst="rect"/>
-                  </pic:spPr>
-                </pic:pic>
-              </a:graphicData>
-            </a:graphic>
-          </wp:inline>
-        </w:drawing>
-      </w:r>
-    </w:p>
-    <w:p>
-      <w:pPr>
-        <w:jc w:val="center"/>
-      </w:pPr>
-      <w:r>
-        <w:t>Figure 6 - Pipeline d'un tour : décision libre, interprétation, rondes d'agents, moteur de règles et sauvegarde. Trace observée : 2 rondes, 7 activations, 4,9 s (jeu-orchestration.png).</w:t>
-      </w:r>
-    </w:p>
-    <w:tbl>
-      <w:tblPr>
-        <w:tblStyle w:val="TableGrid"/>
-        <w:tblW w:type="auto" w:w="0"/>
-        <w:jc w:val="center"/>
-        <w:tblLayout w:type="fixed"/>
-        <w:tblLook w:firstColumn="1" w:firstRow="1" w:lastColumn="0" w:lastRow="0" w:noHBand="0" w:noVBand="1" w:val="04A0"/>
-        <w:tblBorders>
-          <w:top w:val="single" w:sz="5" w:color="D9D9D9"/>
-          <w:left w:val="single" w:sz="5" w:color="D9D9D9"/>
-          <w:bottom w:val="single" w:sz="5" w:color="D9D9D9"/>
-          <w:right w:val="single" w:sz="5" w:color="D9D9D9"/>
-          <w:insideH w:val="single" w:sz="5" w:color="D9D9D9"/>
-          <w:insideV w:val="single" w:sz="5" w:color="D9D9D9"/>
-        </w:tblBorders>
-      </w:tblPr>
-      <w:tblGrid>
-        <w:gridCol w:w="3389"/>
-        <w:gridCol w:w="3389"/>
-        <w:gridCol w:w="3389"/>
-      </w:tblGrid>
-      <w:tr>
-        <w:trPr>
-          <w:tblHeader w:val="true"/>
-          <w:cantSplit/>
-        </w:trPr>
-        <w:tc>
-          <w:tcPr>
-            <w:tcW w:type="dxa" w:w="2232"/>
-            <w:shd w:fill="17212B"/>
-            <w:vAlign w:val="center"/>
-            <w:tcMar>
-              <w:top w:w="110" w:type="dxa"/>
-              <w:start w:w="120" w:type="dxa"/>
-              <w:bottom w:w="110" w:type="dxa"/>
-              <w:end w:w="120" w:type="dxa"/>
-            </w:tcMar>
-          </w:tcPr>
-          <w:p>
-            <w:pPr>
-              <w:jc w:val="left"/>
-            </w:pPr>
-            <w:r>
-              <w:rPr>
-                <w:rFonts w:ascii="Aptos" w:hAnsi="Aptos"/>
-                <w:b/>
-                <w:color w:val="FFFFFF"/>
-                <w:sz w:val="18"/>
-              </w:rPr>
-              <w:t>Indicateur</w:t>
-            </w:r>
-          </w:p>
-        </w:tc>
-        <w:tc>
-          <w:tcPr>
-            <w:tcW w:type="dxa" w:w="2376"/>
-            <w:shd w:fill="17212B"/>
-            <w:vAlign w:val="center"/>
-            <w:tcMar>
-              <w:top w:w="110" w:type="dxa"/>
-              <w:start w:w="120" w:type="dxa"/>
-              <w:bottom w:w="110" w:type="dxa"/>
-              <w:end w:w="120" w:type="dxa"/>
-            </w:tcMar>
-          </w:tcPr>
-          <w:p>
-            <w:r>
-              <w:rPr>
-                <w:rFonts w:ascii="Aptos" w:hAnsi="Aptos" w:eastAsia="Aptos"/>
-                <w:b/>
-                <w:color w:val="FFFFFF"/>
-                <w:sz w:val="18"/>
-              </w:rPr>
-              <w:t>Résultat du parcours</w:t>
-            </w:r>
-          </w:p>
-        </w:tc>
-        <w:tc>
-          <w:tcPr>
-            <w:tcW w:type="dxa" w:w="5472"/>
-            <w:shd w:fill="17212B"/>
-            <w:vAlign w:val="center"/>
-            <w:tcMar>
-              <w:top w:w="110" w:type="dxa"/>
-              <w:start w:w="120" w:type="dxa"/>
-              <w:bottom w:w="110" w:type="dxa"/>
-              <w:end w:w="120" w:type="dxa"/>
-            </w:tcMar>
-          </w:tcPr>
-          <w:p>
-            <w:pPr>
-              <w:jc w:val="left"/>
-            </w:pPr>
-            <w:r>
-              <w:rPr>
-                <w:rFonts w:ascii="Aptos" w:hAnsi="Aptos"/>
-                <w:b/>
-                <w:color w:val="FFFFFF"/>
-                <w:sz w:val="18"/>
-              </w:rPr>
-              <w:t>Lecture</w:t>
-            </w:r>
-          </w:p>
-        </w:tc>
-      </w:tr>
-      <w:tr>
-        <w:trPr>
-          <w:cantSplit/>
-        </w:trPr>
-        <w:tc>
-          <w:tcPr>
-            <w:tcW w:type="dxa" w:w="2232"/>
-            <w:vAlign w:val="center"/>
-            <w:tcMar>
-              <w:top w:w="110" w:type="dxa"/>
-              <w:start w:w="120" w:type="dxa"/>
-              <w:bottom w:w="110" w:type="dxa"/>
-              <w:end w:w="120" w:type="dxa"/>
-            </w:tcMar>
-          </w:tcPr>
-          <w:p>
-            <w:pPr>
-              <w:spacing w:after="0"/>
-            </w:pPr>
-            <w:r>
-              <w:rPr>
-                <w:rFonts w:ascii="Aptos" w:hAnsi="Aptos"/>
-                <w:color w:val="000000"/>
-                <w:sz w:val="17"/>
-              </w:rPr>
-              <w:t>Progression</w:t>
-            </w:r>
-          </w:p>
-        </w:tc>
-        <w:tc>
-          <w:tcPr>
-            <w:tcW w:type="dxa" w:w="2376"/>
-            <w:vAlign w:val="center"/>
-            <w:tcMar>
-              <w:top w:w="110" w:type="dxa"/>
-              <w:start w:w="120" w:type="dxa"/>
-              <w:bottom w:w="110" w:type="dxa"/>
-              <w:end w:w="120" w:type="dxa"/>
-            </w:tcMar>
-          </w:tcPr>
-          <w:p>
-            <w:pPr>
-              <w:spacing w:after="0"/>
-            </w:pPr>
-            <w:r>
-              <w:rPr>
-                <w:rFonts w:ascii="Aptos" w:hAnsi="Aptos"/>
-                <w:color w:val="000000"/>
-                <w:sz w:val="17"/>
-              </w:rPr>
-              <w:t>100 %</w:t>
-            </w:r>
-          </w:p>
-        </w:tc>
-        <w:tc>
-          <w:tcPr>
-            <w:tcW w:type="dxa" w:w="5472"/>
-            <w:vAlign w:val="center"/>
-            <w:tcMar>
-              <w:top w:w="110" w:type="dxa"/>
-              <w:start w:w="120" w:type="dxa"/>
-              <w:bottom w:w="110" w:type="dxa"/>
-              <w:end w:w="120" w:type="dxa"/>
-            </w:tcMar>
-          </w:tcPr>
-          <w:p>
-            <w:pPr>
-              <w:spacing w:after="0"/>
-            </w:pPr>
-            <w:r>
-              <w:rPr>
-                <w:rFonts w:ascii="Aptos" w:hAnsi="Aptos"/>
-                <w:color w:val="000000"/>
-                <w:sz w:val="17"/>
-              </w:rPr>
-              <w:t>Périmètre convenu terminé</w:t>
-            </w:r>
-          </w:p>
-        </w:tc>
-      </w:tr>
-      <w:tr>
-        <w:trPr>
-          <w:cantSplit/>
-        </w:trPr>
-        <w:tc>
-          <w:tcPr>
-            <w:tcW w:type="dxa" w:w="2232"/>
-            <w:vAlign w:val="center"/>
-            <w:tcMar>
-              <w:top w:w="110" w:type="dxa"/>
-              <w:start w:w="120" w:type="dxa"/>
-              <w:bottom w:w="110" w:type="dxa"/>
-              <w:end w:w="120" w:type="dxa"/>
-            </w:tcMar>
-            <w:shd w:fill="F7F9FA"/>
-          </w:tcPr>
-          <w:p>
-            <w:pPr>
-              <w:spacing w:after="0"/>
-            </w:pPr>
-            <w:r>
-              <w:rPr>
-                <w:rFonts w:ascii="Aptos" w:hAnsi="Aptos"/>
-                <w:color w:val="000000"/>
-                <w:sz w:val="17"/>
-              </w:rPr>
-              <w:t>Budget</w:t>
-            </w:r>
-          </w:p>
-        </w:tc>
-        <w:tc>
-          <w:tcPr>
-            <w:tcW w:type="dxa" w:w="2376"/>
-            <w:vAlign w:val="center"/>
-            <w:tcMar>
-              <w:top w:w="110" w:type="dxa"/>
-              <w:start w:w="120" w:type="dxa"/>
-              <w:bottom w:w="110" w:type="dxa"/>
-              <w:end w:w="120" w:type="dxa"/>
-            </w:tcMar>
-            <w:shd w:fill="F7F9FA"/>
-          </w:tcPr>
-          <w:p>
-            <w:pPr>
-              <w:spacing w:after="0"/>
-            </w:pPr>
-            <w:r>
-              <w:rPr>
-                <w:rFonts w:ascii="Aptos" w:hAnsi="Aptos"/>
-                <w:color w:val="000000"/>
-                <w:sz w:val="17"/>
-              </w:rPr>
-              <w:t>34 / 100</w:t>
-            </w:r>
-          </w:p>
-        </w:tc>
-        <w:tc>
-          <w:tcPr>
-            <w:tcW w:type="dxa" w:w="5472"/>
-            <w:vAlign w:val="center"/>
-            <w:tcMar>
-              <w:top w:w="110" w:type="dxa"/>
-              <w:start w:w="120" w:type="dxa"/>
-              <w:bottom w:w="110" w:type="dxa"/>
-              <w:end w:w="120" w:type="dxa"/>
-            </w:tcMar>
-            <w:shd w:fill="F7F9FA"/>
-          </w:tcPr>
-          <w:p>
-            <w:pPr>
-              <w:spacing w:after="0"/>
-            </w:pPr>
-            <w:r>
-              <w:rPr>
-                <w:rFonts w:ascii="Aptos" w:hAnsi="Aptos"/>
-                <w:color w:val="000000"/>
-                <w:sz w:val="17"/>
-              </w:rPr>
-              <w:t>Coûts des décisions et des cinq périodes</w:t>
-            </w:r>
-          </w:p>
-        </w:tc>
-      </w:tr>
-      <w:tr>
-        <w:trPr>
-          <w:cantSplit/>
-        </w:trPr>
-        <w:tc>
-          <w:tcPr>
-            <w:tcW w:type="dxa" w:w="2232"/>
-            <w:vAlign w:val="center"/>
-            <w:tcMar>
-              <w:top w:w="110" w:type="dxa"/>
-              <w:start w:w="120" w:type="dxa"/>
-              <w:bottom w:w="110" w:type="dxa"/>
-              <w:end w:w="120" w:type="dxa"/>
-            </w:tcMar>
-          </w:tcPr>
-          <w:p>
-            <w:pPr>
-              <w:spacing w:after="0"/>
-            </w:pPr>
-            <w:r>
-              <w:rPr>
-                <w:rFonts w:ascii="Aptos" w:hAnsi="Aptos"/>
-                <w:color w:val="000000"/>
-                <w:sz w:val="17"/>
-              </w:rPr>
-              <w:t>Confiance client</w:t>
-            </w:r>
-          </w:p>
-        </w:tc>
-        <w:tc>
-          <w:tcPr>
-            <w:tcW w:type="dxa" w:w="2376"/>
-            <w:vAlign w:val="center"/>
-            <w:tcMar>
-              <w:top w:w="110" w:type="dxa"/>
-              <w:start w:w="120" w:type="dxa"/>
-              <w:bottom w:w="110" w:type="dxa"/>
-              <w:end w:w="120" w:type="dxa"/>
-            </w:tcMar>
-          </w:tcPr>
-          <w:p>
-            <w:pPr>
-              <w:spacing w:after="0"/>
-            </w:pPr>
-            <w:r>
-              <w:rPr>
-                <w:rFonts w:ascii="Aptos" w:hAnsi="Aptos"/>
-                <w:color w:val="000000"/>
-                <w:sz w:val="17"/>
-              </w:rPr>
-              <w:t>73 / 100</w:t>
-            </w:r>
-          </w:p>
-        </w:tc>
-        <w:tc>
-          <w:tcPr>
-            <w:tcW w:type="dxa" w:w="5472"/>
-            <w:vAlign w:val="center"/>
-            <w:tcMar>
-              <w:top w:w="110" w:type="dxa"/>
-              <w:start w:w="120" w:type="dxa"/>
-              <w:bottom w:w="110" w:type="dxa"/>
-              <w:end w:w="120" w:type="dxa"/>
-            </w:tcMar>
-          </w:tcPr>
-          <w:p>
-            <w:pPr>
-              <w:spacing w:after="0"/>
-            </w:pPr>
-            <w:r>
-              <w:rPr>
-                <w:rFonts w:ascii="Aptos" w:hAnsi="Aptos"/>
-                <w:color w:val="000000"/>
-                <w:sz w:val="17"/>
-              </w:rPr>
-              <w:t>Besoin clarifié, périmètre accepté et état communiqué</w:t>
-            </w:r>
-          </w:p>
-        </w:tc>
-      </w:tr>
-      <w:tr>
-        <w:trPr>
-          <w:cantSplit/>
-        </w:trPr>
-        <w:tc>
-          <w:tcPr>
-            <w:tcW w:type="dxa" w:w="2232"/>
-            <w:vAlign w:val="center"/>
-            <w:tcMar>
-              <w:top w:w="110" w:type="dxa"/>
-              <w:start w:w="120" w:type="dxa"/>
-              <w:bottom w:w="110" w:type="dxa"/>
-              <w:end w:w="120" w:type="dxa"/>
-            </w:tcMar>
-            <w:shd w:fill="F7F9FA"/>
-          </w:tcPr>
-          <w:p>
-            <w:pPr>
-              <w:spacing w:after="0"/>
-            </w:pPr>
-            <w:r>
-              <w:rPr>
-                <w:rFonts w:ascii="Aptos" w:hAnsi="Aptos"/>
-                <w:color w:val="000000"/>
-                <w:sz w:val="17"/>
-              </w:rPr>
-              <w:t>Moral</w:t>
-            </w:r>
-          </w:p>
-        </w:tc>
-        <w:tc>
-          <w:tcPr>
-            <w:tcW w:type="dxa" w:w="2376"/>
-            <w:vAlign w:val="center"/>
-            <w:tcMar>
-              <w:top w:w="110" w:type="dxa"/>
-              <w:start w:w="120" w:type="dxa"/>
-              <w:bottom w:w="110" w:type="dxa"/>
-              <w:end w:w="120" w:type="dxa"/>
-            </w:tcMar>
-            <w:shd w:fill="F7F9FA"/>
-          </w:tcPr>
-          <w:p>
-            <w:pPr>
-              <w:spacing w:after="0"/>
-            </w:pPr>
-            <w:r>
-              <w:rPr>
-                <w:rFonts w:ascii="Aptos" w:hAnsi="Aptos"/>
-                <w:color w:val="000000"/>
-                <w:sz w:val="17"/>
-              </w:rPr>
-              <w:t>60 / 100</w:t>
-            </w:r>
-          </w:p>
-        </w:tc>
-        <w:tc>
-          <w:tcPr>
-            <w:tcW w:type="dxa" w:w="5472"/>
-            <w:vAlign w:val="center"/>
-            <w:tcMar>
-              <w:top w:w="110" w:type="dxa"/>
-              <w:start w:w="120" w:type="dxa"/>
-              <w:bottom w:w="110" w:type="dxa"/>
-              <w:end w:w="120" w:type="dxa"/>
-            </w:tcMar>
-            <w:shd w:fill="F7F9FA"/>
-          </w:tcPr>
-          <w:p>
-            <w:pPr>
-              <w:spacing w:after="0"/>
-            </w:pPr>
-            <w:r>
-              <w:rPr>
-                <w:rFonts w:ascii="Aptos" w:hAnsi="Aptos"/>
-                <w:color w:val="000000"/>
-                <w:sz w:val="17"/>
-              </w:rPr>
-              <w:t>Équipe restée opérationnelle sous pression</w:t>
-            </w:r>
-          </w:p>
-        </w:tc>
-      </w:tr>
-      <w:tr>
-        <w:trPr>
-          <w:cantSplit/>
-        </w:trPr>
-        <w:tc>
-          <w:tcPr>
-            <w:tcW w:type="dxa" w:w="2232"/>
-            <w:vAlign w:val="center"/>
-            <w:tcMar>
-              <w:top w:w="110" w:type="dxa"/>
-              <w:start w:w="120" w:type="dxa"/>
-              <w:bottom w:w="110" w:type="dxa"/>
-              <w:end w:w="120" w:type="dxa"/>
-            </w:tcMar>
-          </w:tcPr>
-          <w:p>
-            <w:pPr>
-              <w:spacing w:after="0"/>
-            </w:pPr>
-            <w:r>
-              <w:rPr>
-                <w:rFonts w:ascii="Aptos" w:hAnsi="Aptos"/>
-                <w:color w:val="000000"/>
-                <w:sz w:val="17"/>
-              </w:rPr>
-              <w:t>Sécurité</w:t>
-            </w:r>
-          </w:p>
-        </w:tc>
-        <w:tc>
-          <w:tcPr>
-            <w:tcW w:type="dxa" w:w="2376"/>
-            <w:vAlign w:val="center"/>
-            <w:tcMar>
-              <w:top w:w="110" w:type="dxa"/>
-              <w:start w:w="120" w:type="dxa"/>
-              <w:bottom w:w="110" w:type="dxa"/>
-              <w:end w:w="120" w:type="dxa"/>
-            </w:tcMar>
-          </w:tcPr>
-          <w:p>
-            <w:pPr>
-              <w:spacing w:after="0"/>
-            </w:pPr>
-            <w:r>
-              <w:rPr>
-                <w:rFonts w:ascii="Aptos" w:hAnsi="Aptos"/>
-                <w:color w:val="000000"/>
-                <w:sz w:val="17"/>
-              </w:rPr>
-              <w:t>Vérifiée</w:t>
-            </w:r>
-          </w:p>
-        </w:tc>
-        <w:tc>
-          <w:tcPr>
-            <w:tcW w:type="dxa" w:w="5472"/>
-            <w:vAlign w:val="center"/>
-            <w:tcMar>
-              <w:top w:w="110" w:type="dxa"/>
-              <w:start w:w="120" w:type="dxa"/>
-              <w:bottom w:w="110" w:type="dxa"/>
-              <w:end w:w="120" w:type="dxa"/>
-            </w:tcMar>
-          </w:tcPr>
-          <w:p>
-            <w:pPr>
-              <w:spacing w:after="0"/>
-            </w:pPr>
-            <w:r>
-              <w:rPr>
-                <w:rFonts w:ascii="Aptos" w:hAnsi="Aptos"/>
-                <w:color w:val="000000"/>
-                <w:sz w:val="17"/>
-              </w:rPr>
-              <w:t>Correctif terminé puis contrôlé avant livraison</w:t>
-            </w:r>
-          </w:p>
-        </w:tc>
-      </w:tr>
-    </w:tbl>
-    <w:p>
-      <w:pPr>
-        <w:spacing w:after="0"/>
-      </w:pPr>
-    </w:p>
-    <w:p>
-      <w:pPr>
-        <w:spacing w:before="80" w:after="0"/>
-        <w:jc w:val="center"/>
-      </w:pPr>
-      <w:r>
-        <w:drawing>
-          <wp:inline xmlns:a="http://schemas.openxmlformats.org/drawingml/2006/main" xmlns:pic="http://schemas.openxmlformats.org/drawingml/2006/picture">
-            <wp:extent cx="5943600" cy="3343275"/>
-            <wp:docPr id="8" name="Picture 8" title="Débrief final" descr="Indicateurs finaux, métriques de preuve et trois moments du débrief reliés aux événements."/>
-            <wp:cNvGraphicFramePr>
-              <a:graphicFrameLocks noChangeAspect="1"/>
-            </wp:cNvGraphicFramePr>
-            <a:graphic>
-              <a:graphicData uri="http://schemas.openxmlformats.org/drawingml/2006/picture">
-                <pic:pic>
-                  <pic:nvPicPr>
-                    <pic:cNvPr id="0" name="image.png"/>
-                    <pic:cNvPicPr/>
-                  </pic:nvPicPr>
-                  <pic:blipFill>
-                    <a:blip r:embed="rId26"/>
                     <a:stretch>
                       <a:fillRect/>
                     </a:stretch>
@@ -2806,28 +86,1143 @@
     </w:p>
     <w:p>
       <w:pPr>
-        <w:spacing w:before="80" w:after="160"/>
+        <w:pStyle w:val="Caption"/>
         <w:jc w:val="center"/>
       </w:pPr>
       <w:r>
-        <w:t>Figure 7 - Débrief final : métriques, 46 événements, 17 réponses contextualisées et trois moments reliés à leurs preuves. Source : prototype (jeu-bilan.png).</w:t>
+        <w:t>Figure 1 — Le tableau de commandement réunit la situation, les indicateurs et la consigne libre.</w:t>
+      </w:r>
+    </w:p>
+    <w:p>
+      <w:pPr/>
+      <w:r>
+        <w:t>Le joueur dispose de six tours et de deux décisions de gestion au maximum par tour. Il arbitre entre correctif de sécurité, avancement, périmètre client et charge de l’équipe. Livrer exige un périmètre accepté, le travail terminé et une validation de sécurité ; atteindre 100 % de progression ne suffit pas.</w:t>
+      </w:r>
+    </w:p>
+    <w:tbl>
+      <w:tblPr>
+        <w:tblW w:type="auto" w:w="0"/>
+        <w:jc w:val="center"/>
+        <w:tblLayout w:type="fixed"/>
+        <w:tblLook w:firstColumn="1" w:firstRow="1" w:lastColumn="0" w:lastRow="0" w:noHBand="0" w:noVBand="1" w:val="04A0"/>
+      </w:tblPr>
+      <w:tblGrid>
+        <w:gridCol w:w="2376"/>
+        <w:gridCol w:w="7128"/>
+      </w:tblGrid>
+      <w:tr>
+        <w:trPr>
+          <w:cantSplit/>
+          <w:tblHeader/>
+        </w:trPr>
+        <w:tc>
+          <w:tcPr>
+            <w:tcW w:type="dxa" w:w="2376"/>
+            <w:vAlign w:val="center"/>
+            <w:shd w:fill="243745"/>
+            <w:tcMar>
+              <w:top w:w="90" w:type="dxa"/>
+              <w:left w:w="90" w:type="dxa"/>
+              <w:bottom w:w="90" w:type="dxa"/>
+              <w:right w:w="90" w:type="dxa"/>
+            </w:tcMar>
+            <w:tcBorders>
+              <w:top w:val="single" w:sz="4" w:color="D9D9D9"/>
+              <w:left w:val="single" w:sz="4" w:color="D9D9D9"/>
+              <w:bottom w:val="single" w:sz="4" w:color="D9D9D9"/>
+              <w:right w:val="single" w:sz="4" w:color="D9D9D9"/>
+            </w:tcBorders>
+          </w:tcPr>
+          <w:p>
+            <w:pPr>
+              <w:spacing w:after="100" w:before="100" w:line="245" w:lineRule="auto"/>
+            </w:pPr>
+            <w:r>
+              <w:rPr>
+                <w:b/>
+                <w:color w:val="FFFFFF"/>
+                <w:sz w:val="18"/>
+              </w:rPr>
+              <w:t>Personnage</w:t>
+            </w:r>
+          </w:p>
+        </w:tc>
+        <w:tc>
+          <w:tcPr>
+            <w:tcW w:type="dxa" w:w="7128"/>
+            <w:vAlign w:val="center"/>
+            <w:shd w:fill="243745"/>
+            <w:tcMar>
+              <w:top w:w="90" w:type="dxa"/>
+              <w:left w:w="90" w:type="dxa"/>
+              <w:bottom w:w="90" w:type="dxa"/>
+              <w:right w:w="90" w:type="dxa"/>
+            </w:tcMar>
+            <w:tcBorders>
+              <w:top w:val="single" w:sz="4" w:color="D9D9D9"/>
+              <w:left w:val="single" w:sz="4" w:color="D9D9D9"/>
+              <w:bottom w:val="single" w:sz="4" w:color="D9D9D9"/>
+              <w:right w:val="single" w:sz="4" w:color="D9D9D9"/>
+            </w:tcBorders>
+          </w:tcPr>
+          <w:p>
+            <w:pPr>
+              <w:spacing w:after="100" w:before="100" w:line="245" w:lineRule="auto"/>
+            </w:pPr>
+            <w:r>
+              <w:rPr>
+                <w:b/>
+                <w:color w:val="FFFFFF"/>
+                <w:sz w:val="18"/>
+              </w:rPr>
+              <w:t>Responsabilité</w:t>
+            </w:r>
+          </w:p>
+        </w:tc>
+      </w:tr>
+      <w:tr>
+        <w:trPr>
+          <w:cantSplit/>
+        </w:trPr>
+        <w:tc>
+          <w:tcPr>
+            <w:tcW w:type="dxa" w:w="2376"/>
+            <w:vAlign w:val="center"/>
+            <w:shd w:fill="FFFFFF"/>
+            <w:tcMar>
+              <w:top w:w="90" w:type="dxa"/>
+              <w:left w:w="90" w:type="dxa"/>
+              <w:bottom w:w="90" w:type="dxa"/>
+              <w:right w:w="90" w:type="dxa"/>
+            </w:tcMar>
+            <w:tcBorders>
+              <w:top w:val="single" w:sz="4" w:color="D9D9D9"/>
+              <w:left w:val="single" w:sz="4" w:color="D9D9D9"/>
+              <w:bottom w:val="single" w:sz="4" w:color="D9D9D9"/>
+              <w:right w:val="single" w:sz="4" w:color="D9D9D9"/>
+            </w:tcBorders>
+          </w:tcPr>
+          <w:p>
+            <w:pPr>
+              <w:spacing w:after="100" w:before="100" w:line="245" w:lineRule="auto"/>
+            </w:pPr>
+            <w:r>
+              <w:rPr>
+                <w:sz w:val="18"/>
+              </w:rPr>
+              <w:t>Alex · Développement</w:t>
+            </w:r>
+          </w:p>
+        </w:tc>
+        <w:tc>
+          <w:tcPr>
+            <w:tcW w:type="dxa" w:w="7128"/>
+            <w:vAlign w:val="center"/>
+            <w:shd w:fill="FFFFFF"/>
+            <w:tcMar>
+              <w:top w:w="90" w:type="dxa"/>
+              <w:left w:w="90" w:type="dxa"/>
+              <w:bottom w:w="90" w:type="dxa"/>
+              <w:right w:w="90" w:type="dxa"/>
+            </w:tcMar>
+            <w:tcBorders>
+              <w:top w:val="single" w:sz="4" w:color="D9D9D9"/>
+              <w:left w:val="single" w:sz="4" w:color="D9D9D9"/>
+              <w:bottom w:val="single" w:sz="4" w:color="D9D9D9"/>
+              <w:right w:val="single" w:sz="4" w:color="D9D9D9"/>
+            </w:tcBorders>
+          </w:tcPr>
+          <w:p>
+            <w:pPr>
+              <w:spacing w:after="100" w:before="100" w:line="245" w:lineRule="auto"/>
+            </w:pPr>
+            <w:r>
+              <w:rPr>
+                <w:sz w:val="18"/>
+              </w:rPr>
+              <w:t>Exécuter les priorités et signaler une charge insoutenable.</w:t>
+            </w:r>
+          </w:p>
+        </w:tc>
+      </w:tr>
+      <w:tr>
+        <w:trPr>
+          <w:cantSplit/>
+        </w:trPr>
+        <w:tc>
+          <w:tcPr>
+            <w:tcW w:type="dxa" w:w="2376"/>
+            <w:vAlign w:val="center"/>
+            <w:shd w:fill="F2F5F7"/>
+            <w:tcMar>
+              <w:top w:w="90" w:type="dxa"/>
+              <w:left w:w="90" w:type="dxa"/>
+              <w:bottom w:w="90" w:type="dxa"/>
+              <w:right w:w="90" w:type="dxa"/>
+            </w:tcMar>
+            <w:tcBorders>
+              <w:top w:val="single" w:sz="4" w:color="D9D9D9"/>
+              <w:left w:val="single" w:sz="4" w:color="D9D9D9"/>
+              <w:bottom w:val="single" w:sz="4" w:color="D9D9D9"/>
+              <w:right w:val="single" w:sz="4" w:color="D9D9D9"/>
+            </w:tcBorders>
+          </w:tcPr>
+          <w:p>
+            <w:pPr>
+              <w:spacing w:after="100" w:before="100" w:line="245" w:lineRule="auto"/>
+            </w:pPr>
+            <w:r>
+              <w:rPr>
+                <w:sz w:val="18"/>
+              </w:rPr>
+              <w:t>Camille · Client</w:t>
+            </w:r>
+          </w:p>
+        </w:tc>
+        <w:tc>
+          <w:tcPr>
+            <w:tcW w:type="dxa" w:w="7128"/>
+            <w:vAlign w:val="center"/>
+            <w:shd w:fill="F2F5F7"/>
+            <w:tcMar>
+              <w:top w:w="90" w:type="dxa"/>
+              <w:left w:w="90" w:type="dxa"/>
+              <w:bottom w:w="90" w:type="dxa"/>
+              <w:right w:w="90" w:type="dxa"/>
+            </w:tcMar>
+            <w:tcBorders>
+              <w:top w:val="single" w:sz="4" w:color="D9D9D9"/>
+              <w:left w:val="single" w:sz="4" w:color="D9D9D9"/>
+              <w:bottom w:val="single" w:sz="4" w:color="D9D9D9"/>
+              <w:right w:val="single" w:sz="4" w:color="D9D9D9"/>
+            </w:tcBorders>
+          </w:tcPr>
+          <w:p>
+            <w:pPr>
+              <w:spacing w:after="100" w:before="100" w:line="245" w:lineRule="auto"/>
+            </w:pPr>
+            <w:r>
+              <w:rPr>
+                <w:sz w:val="18"/>
+              </w:rPr>
+              <w:t>Clarifier le besoin et négocier le périmètre ou le délai.</w:t>
+            </w:r>
+          </w:p>
+        </w:tc>
+      </w:tr>
+      <w:tr>
+        <w:trPr>
+          <w:cantSplit/>
+        </w:trPr>
+        <w:tc>
+          <w:tcPr>
+            <w:tcW w:type="dxa" w:w="2376"/>
+            <w:vAlign w:val="center"/>
+            <w:shd w:fill="FFFFFF"/>
+            <w:tcMar>
+              <w:top w:w="90" w:type="dxa"/>
+              <w:left w:w="90" w:type="dxa"/>
+              <w:bottom w:w="90" w:type="dxa"/>
+              <w:right w:w="90" w:type="dxa"/>
+            </w:tcMar>
+            <w:tcBorders>
+              <w:top w:val="single" w:sz="4" w:color="D9D9D9"/>
+              <w:left w:val="single" w:sz="4" w:color="D9D9D9"/>
+              <w:bottom w:val="single" w:sz="4" w:color="D9D9D9"/>
+              <w:right w:val="single" w:sz="4" w:color="D9D9D9"/>
+            </w:tcBorders>
+          </w:tcPr>
+          <w:p>
+            <w:pPr>
+              <w:spacing w:after="100" w:before="100" w:line="245" w:lineRule="auto"/>
+            </w:pPr>
+            <w:r>
+              <w:rPr>
+                <w:sz w:val="18"/>
+              </w:rPr>
+              <w:t>Sam · Commercial</w:t>
+            </w:r>
+          </w:p>
+        </w:tc>
+        <w:tc>
+          <w:tcPr>
+            <w:tcW w:type="dxa" w:w="7128"/>
+            <w:vAlign w:val="center"/>
+            <w:shd w:fill="FFFFFF"/>
+            <w:tcMar>
+              <w:top w:w="90" w:type="dxa"/>
+              <w:left w:w="90" w:type="dxa"/>
+              <w:bottom w:w="90" w:type="dxa"/>
+              <w:right w:w="90" w:type="dxa"/>
+            </w:tcMar>
+            <w:tcBorders>
+              <w:top w:val="single" w:sz="4" w:color="D9D9D9"/>
+              <w:left w:val="single" w:sz="4" w:color="D9D9D9"/>
+              <w:bottom w:val="single" w:sz="4" w:color="D9D9D9"/>
+              <w:right w:val="single" w:sz="4" w:color="D9D9D9"/>
+            </w:tcBorders>
+          </w:tcPr>
+          <w:p>
+            <w:pPr>
+              <w:spacing w:after="100" w:before="100" w:line="245" w:lineRule="auto"/>
+            </w:pPr>
+            <w:r>
+              <w:rPr>
+                <w:sz w:val="18"/>
+              </w:rPr>
+              <w:t>Réconcilier la promesse initiale et les engagements.</w:t>
+            </w:r>
+          </w:p>
+        </w:tc>
+      </w:tr>
+      <w:tr>
+        <w:trPr>
+          <w:cantSplit/>
+        </w:trPr>
+        <w:tc>
+          <w:tcPr>
+            <w:tcW w:type="dxa" w:w="2376"/>
+            <w:vAlign w:val="center"/>
+            <w:shd w:fill="F2F5F7"/>
+            <w:tcMar>
+              <w:top w:w="90" w:type="dxa"/>
+              <w:left w:w="90" w:type="dxa"/>
+              <w:bottom w:w="90" w:type="dxa"/>
+              <w:right w:w="90" w:type="dxa"/>
+            </w:tcMar>
+            <w:tcBorders>
+              <w:top w:val="single" w:sz="4" w:color="D9D9D9"/>
+              <w:left w:val="single" w:sz="4" w:color="D9D9D9"/>
+              <w:bottom w:val="single" w:sz="4" w:color="D9D9D9"/>
+              <w:right w:val="single" w:sz="4" w:color="D9D9D9"/>
+            </w:tcBorders>
+          </w:tcPr>
+          <w:p>
+            <w:pPr>
+              <w:spacing w:after="100" w:before="100" w:line="245" w:lineRule="auto"/>
+            </w:pPr>
+            <w:r>
+              <w:rPr>
+                <w:sz w:val="18"/>
+              </w:rPr>
+              <w:t>Morgan · Sécurité</w:t>
+            </w:r>
+          </w:p>
+        </w:tc>
+        <w:tc>
+          <w:tcPr>
+            <w:tcW w:type="dxa" w:w="7128"/>
+            <w:vAlign w:val="center"/>
+            <w:shd w:fill="F2F5F7"/>
+            <w:tcMar>
+              <w:top w:w="90" w:type="dxa"/>
+              <w:left w:w="90" w:type="dxa"/>
+              <w:bottom w:w="90" w:type="dxa"/>
+              <w:right w:w="90" w:type="dxa"/>
+            </w:tcMar>
+            <w:tcBorders>
+              <w:top w:val="single" w:sz="4" w:color="D9D9D9"/>
+              <w:left w:val="single" w:sz="4" w:color="D9D9D9"/>
+              <w:bottom w:val="single" w:sz="4" w:color="D9D9D9"/>
+              <w:right w:val="single" w:sz="4" w:color="D9D9D9"/>
+            </w:tcBorders>
+          </w:tcPr>
+          <w:p>
+            <w:pPr>
+              <w:spacing w:after="100" w:before="100" w:line="245" w:lineRule="auto"/>
+            </w:pPr>
+            <w:r>
+              <w:rPr>
+                <w:sz w:val="18"/>
+              </w:rPr>
+              <w:t>Auditer le défaut et vérifier la correction.</w:t>
+            </w:r>
+          </w:p>
+        </w:tc>
+      </w:tr>
+    </w:tbl>
+    <w:p>
+      <w:pPr>
+        <w:spacing w:after="0"/>
+      </w:pPr>
+    </w:p>
+    <w:p>
+      <w:pPr/>
+      <w:r>
+        <w:t>L’intention pédagogique est d’apprendre par la décision, l’observation et la reprise d’une stratégie. Le débrief relie les arbitrages à leurs événements sources ; l’efficacité de cet apprentissage reste à évaluer avec des participants.</w:t>
+      </w:r>
+    </w:p>
+    <w:p>
+      <w:r>
+        <w:br w:type="page"/>
       </w:r>
     </w:p>
     <w:p>
       <w:pPr>
         <w:pStyle w:val="Heading1"/>
-        <w:keepNext/>
       </w:pPr>
       <w:r>
-        <w:t>7  Conclusion et sources</w:t>
+        <w:t>2  Architecture et moteur métier</w:t>
+      </w:r>
+    </w:p>
+    <w:p>
+      <w:pPr/>
+      <w:r>
+        <w:t>Le navigateur présente le jeu et envoie les commandes au backend. Python concentre les règles, les appels LLM et la persistance. Cette séparation permet de faire varier les réponses des personnages tout en conservant des conséquences calculables et une trace commune à toute l’interface.</w:t>
       </w:r>
     </w:p>
     <w:p>
       <w:pPr>
-        <w:widowControl/>
+        <w:keepNext/>
+        <w:spacing w:after="60"/>
+        <w:jc w:val="center"/>
       </w:pPr>
       <w:r>
-        <w:t>La partie observée aboutit à une livraison contrôlée en cinq tours, avec le périmètre terminé et la sécurité vérifiée. Ce résultat montre l'apport principal de Project Meltdown : le joueur conserve la liberté du langage naturel, tandis que les rôles séparés, les règles métier, la persistance et les événements sources rendent chaque conséquence explicable. Le prototype réunit ainsi une expérience jouable, une architecture multi-agent et un objectif pédagogique dans un même parcours documenté.</w:t>
+        <w:drawing>
+          <wp:inline xmlns:a="http://schemas.openxmlformats.org/drawingml/2006/main" xmlns:pic="http://schemas.openxmlformats.org/drawingml/2006/picture">
+            <wp:extent cx="5943600" cy="2707640"/>
+            <wp:docPr id="2" name="Picture 2"/>
+            <wp:cNvGraphicFramePr>
+              <a:graphicFrameLocks noChangeAspect="1"/>
+            </wp:cNvGraphicFramePr>
+            <a:graphic>
+              <a:graphicData uri="http://schemas.openxmlformats.org/drawingml/2006/picture">
+                <pic:pic>
+                  <pic:nvPicPr>
+                    <pic:cNvPr id="0" name="architecture-project-meltdown.png"/>
+                    <pic:cNvPicPr/>
+                  </pic:nvPicPr>
+                  <pic:blipFill>
+                    <a:blip r:embed="rId12"/>
+                    <a:stretch>
+                      <a:fillRect/>
+                    </a:stretch>
+                  </pic:blipFill>
+                  <pic:spPr>
+                    <a:xfrm>
+                      <a:off x="0" y="0"/>
+                      <a:ext cx="5943600" cy="2707640"/>
+                    </a:xfrm>
+                    <a:prstGeom prst="rect"/>
+                  </pic:spPr>
+                </pic:pic>
+              </a:graphicData>
+            </a:graphic>
+          </wp:inline>
+        </w:drawing>
+      </w:r>
+    </w:p>
+    <w:p>
+      <w:pPr>
+        <w:pStyle w:val="Caption"/>
+        <w:jc w:val="center"/>
+      </w:pPr>
+      <w:r>
+        <w:t>Figure 2 — La consigne traverse des responsabilités distinctes avant la publication du nouvel état.</w:t>
+      </w:r>
+    </w:p>
+    <w:tbl>
+      <w:tblPr>
+        <w:tblW w:type="auto" w:w="0"/>
+        <w:jc w:val="center"/>
+        <w:tblLayout w:type="fixed"/>
+        <w:tblLook w:firstColumn="1" w:firstRow="1" w:lastColumn="0" w:lastRow="0" w:noHBand="0" w:noVBand="1" w:val="04A0"/>
+      </w:tblPr>
+      <w:tblGrid>
+        <w:gridCol w:w="1584"/>
+        <w:gridCol w:w="3600"/>
+        <w:gridCol w:w="4320"/>
+      </w:tblGrid>
+      <w:tr>
+        <w:trPr>
+          <w:cantSplit/>
+          <w:tblHeader/>
+        </w:trPr>
+        <w:tc>
+          <w:tcPr>
+            <w:tcW w:type="dxa" w:w="1584"/>
+            <w:vAlign w:val="center"/>
+            <w:shd w:fill="243745"/>
+            <w:tcMar>
+              <w:top w:w="90" w:type="dxa"/>
+              <w:left w:w="90" w:type="dxa"/>
+              <w:bottom w:w="90" w:type="dxa"/>
+              <w:right w:w="90" w:type="dxa"/>
+            </w:tcMar>
+            <w:tcBorders>
+              <w:top w:val="single" w:sz="4" w:color="D9D9D9"/>
+              <w:left w:val="single" w:sz="4" w:color="D9D9D9"/>
+              <w:bottom w:val="single" w:sz="4" w:color="D9D9D9"/>
+              <w:right w:val="single" w:sz="4" w:color="D9D9D9"/>
+            </w:tcBorders>
+          </w:tcPr>
+          <w:p>
+            <w:pPr>
+              <w:spacing w:after="100" w:before="100" w:line="245" w:lineRule="auto"/>
+            </w:pPr>
+            <w:r>
+              <w:rPr>
+                <w:b/>
+                <w:color w:val="FFFFFF"/>
+                <w:sz w:val="18"/>
+              </w:rPr>
+              <w:t>Couche</w:t>
+            </w:r>
+          </w:p>
+        </w:tc>
+        <w:tc>
+          <w:tcPr>
+            <w:tcW w:type="dxa" w:w="3600"/>
+            <w:vAlign w:val="center"/>
+            <w:shd w:fill="243745"/>
+            <w:tcMar>
+              <w:top w:w="90" w:type="dxa"/>
+              <w:left w:w="90" w:type="dxa"/>
+              <w:bottom w:w="90" w:type="dxa"/>
+              <w:right w:w="90" w:type="dxa"/>
+            </w:tcMar>
+            <w:tcBorders>
+              <w:top w:val="single" w:sz="4" w:color="D9D9D9"/>
+              <w:left w:val="single" w:sz="4" w:color="D9D9D9"/>
+              <w:bottom w:val="single" w:sz="4" w:color="D9D9D9"/>
+              <w:right w:val="single" w:sz="4" w:color="D9D9D9"/>
+            </w:tcBorders>
+          </w:tcPr>
+          <w:p>
+            <w:pPr>
+              <w:spacing w:after="100" w:before="100" w:line="245" w:lineRule="auto"/>
+            </w:pPr>
+            <w:r>
+              <w:rPr>
+                <w:b/>
+                <w:color w:val="FFFFFF"/>
+                <w:sz w:val="18"/>
+              </w:rPr>
+              <w:t>Technologies</w:t>
+            </w:r>
+          </w:p>
+        </w:tc>
+        <w:tc>
+          <w:tcPr>
+            <w:tcW w:type="dxa" w:w="4320"/>
+            <w:vAlign w:val="center"/>
+            <w:shd w:fill="243745"/>
+            <w:tcMar>
+              <w:top w:w="90" w:type="dxa"/>
+              <w:left w:w="90" w:type="dxa"/>
+              <w:bottom w:w="90" w:type="dxa"/>
+              <w:right w:w="90" w:type="dxa"/>
+            </w:tcMar>
+            <w:tcBorders>
+              <w:top w:val="single" w:sz="4" w:color="D9D9D9"/>
+              <w:left w:val="single" w:sz="4" w:color="D9D9D9"/>
+              <w:bottom w:val="single" w:sz="4" w:color="D9D9D9"/>
+              <w:right w:val="single" w:sz="4" w:color="D9D9D9"/>
+            </w:tcBorders>
+          </w:tcPr>
+          <w:p>
+            <w:pPr>
+              <w:spacing w:after="100" w:before="100" w:line="245" w:lineRule="auto"/>
+            </w:pPr>
+            <w:r>
+              <w:rPr>
+                <w:b/>
+                <w:color w:val="FFFFFF"/>
+                <w:sz w:val="18"/>
+              </w:rPr>
+              <w:t>Fonction</w:t>
+            </w:r>
+          </w:p>
+        </w:tc>
+      </w:tr>
+      <w:tr>
+        <w:trPr>
+          <w:cantSplit/>
+        </w:trPr>
+        <w:tc>
+          <w:tcPr>
+            <w:tcW w:type="dxa" w:w="1584"/>
+            <w:vAlign w:val="center"/>
+            <w:shd w:fill="FFFFFF"/>
+            <w:tcMar>
+              <w:top w:w="90" w:type="dxa"/>
+              <w:left w:w="90" w:type="dxa"/>
+              <w:bottom w:w="90" w:type="dxa"/>
+              <w:right w:w="90" w:type="dxa"/>
+            </w:tcMar>
+            <w:tcBorders>
+              <w:top w:val="single" w:sz="4" w:color="D9D9D9"/>
+              <w:left w:val="single" w:sz="4" w:color="D9D9D9"/>
+              <w:bottom w:val="single" w:sz="4" w:color="D9D9D9"/>
+              <w:right w:val="single" w:sz="4" w:color="D9D9D9"/>
+            </w:tcBorders>
+          </w:tcPr>
+          <w:p>
+            <w:pPr>
+              <w:spacing w:after="100" w:before="100" w:line="245" w:lineRule="auto"/>
+            </w:pPr>
+            <w:r>
+              <w:rPr>
+                <w:sz w:val="18"/>
+              </w:rPr>
+              <w:t>Interface</w:t>
+            </w:r>
+          </w:p>
+        </w:tc>
+        <w:tc>
+          <w:tcPr>
+            <w:tcW w:type="dxa" w:w="3600"/>
+            <w:vAlign w:val="center"/>
+            <w:shd w:fill="FFFFFF"/>
+            <w:tcMar>
+              <w:top w:w="90" w:type="dxa"/>
+              <w:left w:w="90" w:type="dxa"/>
+              <w:bottom w:w="90" w:type="dxa"/>
+              <w:right w:w="90" w:type="dxa"/>
+            </w:tcMar>
+            <w:tcBorders>
+              <w:top w:val="single" w:sz="4" w:color="D9D9D9"/>
+              <w:left w:val="single" w:sz="4" w:color="D9D9D9"/>
+              <w:bottom w:val="single" w:sz="4" w:color="D9D9D9"/>
+              <w:right w:val="single" w:sz="4" w:color="D9D9D9"/>
+            </w:tcBorders>
+          </w:tcPr>
+          <w:p>
+            <w:pPr>
+              <w:spacing w:after="100" w:before="100" w:line="245" w:lineRule="auto"/>
+            </w:pPr>
+            <w:r>
+              <w:rPr>
+                <w:sz w:val="18"/>
+              </w:rPr>
+              <w:t>Next.js · React · TypeScript</w:t>
+            </w:r>
+          </w:p>
+        </w:tc>
+        <w:tc>
+          <w:tcPr>
+            <w:tcW w:type="dxa" w:w="4320"/>
+            <w:vAlign w:val="center"/>
+            <w:shd w:fill="FFFFFF"/>
+            <w:tcMar>
+              <w:top w:w="90" w:type="dxa"/>
+              <w:left w:w="90" w:type="dxa"/>
+              <w:bottom w:w="90" w:type="dxa"/>
+              <w:right w:w="90" w:type="dxa"/>
+            </w:tcMar>
+            <w:tcBorders>
+              <w:top w:val="single" w:sz="4" w:color="D9D9D9"/>
+              <w:left w:val="single" w:sz="4" w:color="D9D9D9"/>
+              <w:bottom w:val="single" w:sz="4" w:color="D9D9D9"/>
+              <w:right w:val="single" w:sz="4" w:color="D9D9D9"/>
+            </w:tcBorders>
+          </w:tcPr>
+          <w:p>
+            <w:pPr>
+              <w:spacing w:after="100" w:before="100" w:line="245" w:lineRule="auto"/>
+            </w:pPr>
+            <w:r>
+              <w:rPr>
+                <w:sz w:val="18"/>
+              </w:rPr>
+              <w:t>Saisie, polling, chronologie et débrief.</w:t>
+            </w:r>
+          </w:p>
+        </w:tc>
+      </w:tr>
+      <w:tr>
+        <w:trPr>
+          <w:cantSplit/>
+        </w:trPr>
+        <w:tc>
+          <w:tcPr>
+            <w:tcW w:type="dxa" w:w="1584"/>
+            <w:vAlign w:val="center"/>
+            <w:shd w:fill="F2F5F7"/>
+            <w:tcMar>
+              <w:top w:w="90" w:type="dxa"/>
+              <w:left w:w="90" w:type="dxa"/>
+              <w:bottom w:w="90" w:type="dxa"/>
+              <w:right w:w="90" w:type="dxa"/>
+            </w:tcMar>
+            <w:tcBorders>
+              <w:top w:val="single" w:sz="4" w:color="D9D9D9"/>
+              <w:left w:val="single" w:sz="4" w:color="D9D9D9"/>
+              <w:bottom w:val="single" w:sz="4" w:color="D9D9D9"/>
+              <w:right w:val="single" w:sz="4" w:color="D9D9D9"/>
+            </w:tcBorders>
+          </w:tcPr>
+          <w:p>
+            <w:pPr>
+              <w:spacing w:after="100" w:before="100" w:line="245" w:lineRule="auto"/>
+            </w:pPr>
+            <w:r>
+              <w:rPr>
+                <w:sz w:val="18"/>
+              </w:rPr>
+              <w:t>Bureau 3D</w:t>
+            </w:r>
+          </w:p>
+        </w:tc>
+        <w:tc>
+          <w:tcPr>
+            <w:tcW w:type="dxa" w:w="3600"/>
+            <w:vAlign w:val="center"/>
+            <w:shd w:fill="F2F5F7"/>
+            <w:tcMar>
+              <w:top w:w="90" w:type="dxa"/>
+              <w:left w:w="90" w:type="dxa"/>
+              <w:bottom w:w="90" w:type="dxa"/>
+              <w:right w:w="90" w:type="dxa"/>
+            </w:tcMar>
+            <w:tcBorders>
+              <w:top w:val="single" w:sz="4" w:color="D9D9D9"/>
+              <w:left w:val="single" w:sz="4" w:color="D9D9D9"/>
+              <w:bottom w:val="single" w:sz="4" w:color="D9D9D9"/>
+              <w:right w:val="single" w:sz="4" w:color="D9D9D9"/>
+            </w:tcBorders>
+          </w:tcPr>
+          <w:p>
+            <w:pPr>
+              <w:spacing w:after="100" w:before="100" w:line="245" w:lineRule="auto"/>
+            </w:pPr>
+            <w:r>
+              <w:rPr>
+                <w:sz w:val="18"/>
+              </w:rPr>
+              <w:t>Three.js · React Three Fiber · Drei</w:t>
+            </w:r>
+          </w:p>
+        </w:tc>
+        <w:tc>
+          <w:tcPr>
+            <w:tcW w:type="dxa" w:w="4320"/>
+            <w:vAlign w:val="center"/>
+            <w:shd w:fill="F2F5F7"/>
+            <w:tcMar>
+              <w:top w:w="90" w:type="dxa"/>
+              <w:left w:w="90" w:type="dxa"/>
+              <w:bottom w:w="90" w:type="dxa"/>
+              <w:right w:w="90" w:type="dxa"/>
+            </w:tcMar>
+            <w:tcBorders>
+              <w:top w:val="single" w:sz="4" w:color="D9D9D9"/>
+              <w:left w:val="single" w:sz="4" w:color="D9D9D9"/>
+              <w:bottom w:val="single" w:sz="4" w:color="D9D9D9"/>
+              <w:right w:val="single" w:sz="4" w:color="D9D9D9"/>
+            </w:tcBorders>
+          </w:tcPr>
+          <w:p>
+            <w:pPr>
+              <w:spacing w:after="100" w:before="100" w:line="245" w:lineRule="auto"/>
+            </w:pPr>
+            <w:r>
+              <w:rPr>
+                <w:sz w:val="18"/>
+              </w:rPr>
+              <w:t>Représentation interactive de l’état public.</w:t>
+            </w:r>
+          </w:p>
+        </w:tc>
+      </w:tr>
+      <w:tr>
+        <w:trPr>
+          <w:cantSplit/>
+        </w:trPr>
+        <w:tc>
+          <w:tcPr>
+            <w:tcW w:type="dxa" w:w="1584"/>
+            <w:vAlign w:val="center"/>
+            <w:shd w:fill="FFFFFF"/>
+            <w:tcMar>
+              <w:top w:w="90" w:type="dxa"/>
+              <w:left w:w="90" w:type="dxa"/>
+              <w:bottom w:w="90" w:type="dxa"/>
+              <w:right w:w="90" w:type="dxa"/>
+            </w:tcMar>
+            <w:tcBorders>
+              <w:top w:val="single" w:sz="4" w:color="D9D9D9"/>
+              <w:left w:val="single" w:sz="4" w:color="D9D9D9"/>
+              <w:bottom w:val="single" w:sz="4" w:color="D9D9D9"/>
+              <w:right w:val="single" w:sz="4" w:color="D9D9D9"/>
+            </w:tcBorders>
+          </w:tcPr>
+          <w:p>
+            <w:pPr>
+              <w:spacing w:after="100" w:before="100" w:line="245" w:lineRule="auto"/>
+            </w:pPr>
+            <w:r>
+              <w:rPr>
+                <w:sz w:val="18"/>
+              </w:rPr>
+              <w:t>API et contrats</w:t>
+            </w:r>
+          </w:p>
+        </w:tc>
+        <w:tc>
+          <w:tcPr>
+            <w:tcW w:type="dxa" w:w="3600"/>
+            <w:vAlign w:val="center"/>
+            <w:shd w:fill="FFFFFF"/>
+            <w:tcMar>
+              <w:top w:w="90" w:type="dxa"/>
+              <w:left w:w="90" w:type="dxa"/>
+              <w:bottom w:w="90" w:type="dxa"/>
+              <w:right w:w="90" w:type="dxa"/>
+            </w:tcMar>
+            <w:tcBorders>
+              <w:top w:val="single" w:sz="4" w:color="D9D9D9"/>
+              <w:left w:val="single" w:sz="4" w:color="D9D9D9"/>
+              <w:bottom w:val="single" w:sz="4" w:color="D9D9D9"/>
+              <w:right w:val="single" w:sz="4" w:color="D9D9D9"/>
+            </w:tcBorders>
+          </w:tcPr>
+          <w:p>
+            <w:pPr>
+              <w:spacing w:after="100" w:before="100" w:line="245" w:lineRule="auto"/>
+            </w:pPr>
+            <w:r>
+              <w:rPr>
+                <w:sz w:val="18"/>
+              </w:rPr>
+              <w:t>FastAPI · Pydantic</w:t>
+            </w:r>
+          </w:p>
+        </w:tc>
+        <w:tc>
+          <w:tcPr>
+            <w:tcW w:type="dxa" w:w="4320"/>
+            <w:vAlign w:val="center"/>
+            <w:shd w:fill="FFFFFF"/>
+            <w:tcMar>
+              <w:top w:w="90" w:type="dxa"/>
+              <w:left w:w="90" w:type="dxa"/>
+              <w:bottom w:w="90" w:type="dxa"/>
+              <w:right w:w="90" w:type="dxa"/>
+            </w:tcMar>
+            <w:tcBorders>
+              <w:top w:val="single" w:sz="4" w:color="D9D9D9"/>
+              <w:left w:val="single" w:sz="4" w:color="D9D9D9"/>
+              <w:bottom w:val="single" w:sz="4" w:color="D9D9D9"/>
+              <w:right w:val="single" w:sz="4" w:color="D9D9D9"/>
+            </w:tcBorders>
+          </w:tcPr>
+          <w:p>
+            <w:pPr>
+              <w:spacing w:after="100" w:before="100" w:line="245" w:lineRule="auto"/>
+            </w:pPr>
+            <w:r>
+              <w:rPr>
+                <w:sz w:val="18"/>
+              </w:rPr>
+              <w:t>Validation des requêtes et des réponses.</w:t>
+            </w:r>
+          </w:p>
+        </w:tc>
+      </w:tr>
+      <w:tr>
+        <w:trPr>
+          <w:cantSplit/>
+        </w:trPr>
+        <w:tc>
+          <w:tcPr>
+            <w:tcW w:type="dxa" w:w="1584"/>
+            <w:vAlign w:val="center"/>
+            <w:shd w:fill="F2F5F7"/>
+            <w:tcMar>
+              <w:top w:w="90" w:type="dxa"/>
+              <w:left w:w="90" w:type="dxa"/>
+              <w:bottom w:w="90" w:type="dxa"/>
+              <w:right w:w="90" w:type="dxa"/>
+            </w:tcMar>
+            <w:tcBorders>
+              <w:top w:val="single" w:sz="4" w:color="D9D9D9"/>
+              <w:left w:val="single" w:sz="4" w:color="D9D9D9"/>
+              <w:bottom w:val="single" w:sz="4" w:color="D9D9D9"/>
+              <w:right w:val="single" w:sz="4" w:color="D9D9D9"/>
+            </w:tcBorders>
+          </w:tcPr>
+          <w:p>
+            <w:pPr>
+              <w:spacing w:after="100" w:before="100" w:line="245" w:lineRule="auto"/>
+            </w:pPr>
+            <w:r>
+              <w:rPr>
+                <w:sz w:val="18"/>
+              </w:rPr>
+              <w:t>Agents</w:t>
+            </w:r>
+          </w:p>
+        </w:tc>
+        <w:tc>
+          <w:tcPr>
+            <w:tcW w:type="dxa" w:w="3600"/>
+            <w:vAlign w:val="center"/>
+            <w:shd w:fill="F2F5F7"/>
+            <w:tcMar>
+              <w:top w:w="90" w:type="dxa"/>
+              <w:left w:w="90" w:type="dxa"/>
+              <w:bottom w:w="90" w:type="dxa"/>
+              <w:right w:w="90" w:type="dxa"/>
+            </w:tcMar>
+            <w:tcBorders>
+              <w:top w:val="single" w:sz="4" w:color="D9D9D9"/>
+              <w:left w:val="single" w:sz="4" w:color="D9D9D9"/>
+              <w:bottom w:val="single" w:sz="4" w:color="D9D9D9"/>
+              <w:right w:val="single" w:sz="4" w:color="D9D9D9"/>
+            </w:tcBorders>
+          </w:tcPr>
+          <w:p>
+            <w:pPr>
+              <w:spacing w:after="100" w:before="100" w:line="245" w:lineRule="auto"/>
+            </w:pPr>
+            <w:r>
+              <w:rPr>
+                <w:sz w:val="18"/>
+              </w:rPr>
+              <w:t>LangChain · modèle configuré</w:t>
+            </w:r>
+          </w:p>
+        </w:tc>
+        <w:tc>
+          <w:tcPr>
+            <w:tcW w:type="dxa" w:w="4320"/>
+            <w:vAlign w:val="center"/>
+            <w:shd w:fill="F2F5F7"/>
+            <w:tcMar>
+              <w:top w:w="90" w:type="dxa"/>
+              <w:left w:w="90" w:type="dxa"/>
+              <w:bottom w:w="90" w:type="dxa"/>
+              <w:right w:w="90" w:type="dxa"/>
+            </w:tcMar>
+            <w:tcBorders>
+              <w:top w:val="single" w:sz="4" w:color="D9D9D9"/>
+              <w:left w:val="single" w:sz="4" w:color="D9D9D9"/>
+              <w:bottom w:val="single" w:sz="4" w:color="D9D9D9"/>
+              <w:right w:val="single" w:sz="4" w:color="D9D9D9"/>
+            </w:tcBorders>
+          </w:tcPr>
+          <w:p>
+            <w:pPr>
+              <w:spacing w:after="100" w:before="100" w:line="245" w:lineRule="auto"/>
+            </w:pPr>
+            <w:r>
+              <w:rPr>
+                <w:sz w:val="18"/>
+              </w:rPr>
+              <w:t>Interprétation et intentions structurées.</w:t>
+            </w:r>
+          </w:p>
+        </w:tc>
+      </w:tr>
+      <w:tr>
+        <w:trPr>
+          <w:cantSplit/>
+        </w:trPr>
+        <w:tc>
+          <w:tcPr>
+            <w:tcW w:type="dxa" w:w="1584"/>
+            <w:vAlign w:val="center"/>
+            <w:shd w:fill="FFFFFF"/>
+            <w:tcMar>
+              <w:top w:w="90" w:type="dxa"/>
+              <w:left w:w="90" w:type="dxa"/>
+              <w:bottom w:w="90" w:type="dxa"/>
+              <w:right w:w="90" w:type="dxa"/>
+            </w:tcMar>
+            <w:tcBorders>
+              <w:top w:val="single" w:sz="4" w:color="D9D9D9"/>
+              <w:left w:val="single" w:sz="4" w:color="D9D9D9"/>
+              <w:bottom w:val="single" w:sz="4" w:color="D9D9D9"/>
+              <w:right w:val="single" w:sz="4" w:color="D9D9D9"/>
+            </w:tcBorders>
+          </w:tcPr>
+          <w:p>
+            <w:pPr>
+              <w:spacing w:after="100" w:before="100" w:line="245" w:lineRule="auto"/>
+            </w:pPr>
+            <w:r>
+              <w:rPr>
+                <w:sz w:val="18"/>
+              </w:rPr>
+              <w:t>Orchestration</w:t>
+            </w:r>
+          </w:p>
+        </w:tc>
+        <w:tc>
+          <w:tcPr>
+            <w:tcW w:type="dxa" w:w="3600"/>
+            <w:vAlign w:val="center"/>
+            <w:shd w:fill="FFFFFF"/>
+            <w:tcMar>
+              <w:top w:w="90" w:type="dxa"/>
+              <w:left w:w="90" w:type="dxa"/>
+              <w:bottom w:w="90" w:type="dxa"/>
+              <w:right w:w="90" w:type="dxa"/>
+            </w:tcMar>
+            <w:tcBorders>
+              <w:top w:val="single" w:sz="4" w:color="D9D9D9"/>
+              <w:left w:val="single" w:sz="4" w:color="D9D9D9"/>
+              <w:bottom w:val="single" w:sz="4" w:color="D9D9D9"/>
+              <w:right w:val="single" w:sz="4" w:color="D9D9D9"/>
+            </w:tcBorders>
+          </w:tcPr>
+          <w:p>
+            <w:pPr>
+              <w:spacing w:after="100" w:before="100" w:line="245" w:lineRule="auto"/>
+            </w:pPr>
+            <w:r>
+              <w:rPr>
+                <w:sz w:val="18"/>
+              </w:rPr>
+              <w:t>LangGraph</w:t>
+            </w:r>
+          </w:p>
+        </w:tc>
+        <w:tc>
+          <w:tcPr>
+            <w:tcW w:type="dxa" w:w="4320"/>
+            <w:vAlign w:val="center"/>
+            <w:shd w:fill="FFFFFF"/>
+            <w:tcMar>
+              <w:top w:w="90" w:type="dxa"/>
+              <w:left w:w="90" w:type="dxa"/>
+              <w:bottom w:w="90" w:type="dxa"/>
+              <w:right w:w="90" w:type="dxa"/>
+            </w:tcMar>
+            <w:tcBorders>
+              <w:top w:val="single" w:sz="4" w:color="D9D9D9"/>
+              <w:left w:val="single" w:sz="4" w:color="D9D9D9"/>
+              <w:bottom w:val="single" w:sz="4" w:color="D9D9D9"/>
+              <w:right w:val="single" w:sz="4" w:color="D9D9D9"/>
+            </w:tcBorders>
+          </w:tcPr>
+          <w:p>
+            <w:pPr>
+              <w:spacing w:after="100" w:before="100" w:line="245" w:lineRule="auto"/>
+            </w:pPr>
+            <w:r>
+              <w:rPr>
+                <w:sz w:val="18"/>
+              </w:rPr>
+              <w:t>Distribution, interruptions et reprise.</w:t>
+            </w:r>
+          </w:p>
+        </w:tc>
+      </w:tr>
+      <w:tr>
+        <w:trPr>
+          <w:cantSplit/>
+        </w:trPr>
+        <w:tc>
+          <w:tcPr>
+            <w:tcW w:type="dxa" w:w="1584"/>
+            <w:vAlign w:val="center"/>
+            <w:shd w:fill="F2F5F7"/>
+            <w:tcMar>
+              <w:top w:w="90" w:type="dxa"/>
+              <w:left w:w="90" w:type="dxa"/>
+              <w:bottom w:w="90" w:type="dxa"/>
+              <w:right w:w="90" w:type="dxa"/>
+            </w:tcMar>
+            <w:tcBorders>
+              <w:top w:val="single" w:sz="4" w:color="D9D9D9"/>
+              <w:left w:val="single" w:sz="4" w:color="D9D9D9"/>
+              <w:bottom w:val="single" w:sz="4" w:color="D9D9D9"/>
+              <w:right w:val="single" w:sz="4" w:color="D9D9D9"/>
+            </w:tcBorders>
+          </w:tcPr>
+          <w:p>
+            <w:pPr>
+              <w:spacing w:after="100" w:before="100" w:line="245" w:lineRule="auto"/>
+            </w:pPr>
+            <w:r>
+              <w:rPr>
+                <w:sz w:val="18"/>
+              </w:rPr>
+              <w:t>Stockage</w:t>
+            </w:r>
+          </w:p>
+        </w:tc>
+        <w:tc>
+          <w:tcPr>
+            <w:tcW w:type="dxa" w:w="3600"/>
+            <w:vAlign w:val="center"/>
+            <w:shd w:fill="F2F5F7"/>
+            <w:tcMar>
+              <w:top w:w="90" w:type="dxa"/>
+              <w:left w:w="90" w:type="dxa"/>
+              <w:bottom w:w="90" w:type="dxa"/>
+              <w:right w:w="90" w:type="dxa"/>
+            </w:tcMar>
+            <w:tcBorders>
+              <w:top w:val="single" w:sz="4" w:color="D9D9D9"/>
+              <w:left w:val="single" w:sz="4" w:color="D9D9D9"/>
+              <w:bottom w:val="single" w:sz="4" w:color="D9D9D9"/>
+              <w:right w:val="single" w:sz="4" w:color="D9D9D9"/>
+            </w:tcBorders>
+          </w:tcPr>
+          <w:p>
+            <w:pPr>
+              <w:spacing w:after="100" w:before="100" w:line="245" w:lineRule="auto"/>
+            </w:pPr>
+            <w:r>
+              <w:rPr>
+                <w:sz w:val="18"/>
+              </w:rPr>
+              <w:t>SQLite · checkpointer SQLite</w:t>
+            </w:r>
+          </w:p>
+        </w:tc>
+        <w:tc>
+          <w:tcPr>
+            <w:tcW w:type="dxa" w:w="4320"/>
+            <w:vAlign w:val="center"/>
+            <w:shd w:fill="F2F5F7"/>
+            <w:tcMar>
+              <w:top w:w="90" w:type="dxa"/>
+              <w:left w:w="90" w:type="dxa"/>
+              <w:bottom w:w="90" w:type="dxa"/>
+              <w:right w:w="90" w:type="dxa"/>
+            </w:tcMar>
+            <w:tcBorders>
+              <w:top w:val="single" w:sz="4" w:color="D9D9D9"/>
+              <w:left w:val="single" w:sz="4" w:color="D9D9D9"/>
+              <w:bottom w:val="single" w:sz="4" w:color="D9D9D9"/>
+              <w:right w:val="single" w:sz="4" w:color="D9D9D9"/>
+            </w:tcBorders>
+          </w:tcPr>
+          <w:p>
+            <w:pPr>
+              <w:spacing w:after="100" w:before="100" w:line="245" w:lineRule="auto"/>
+            </w:pPr>
+            <w:r>
+              <w:rPr>
+                <w:sz w:val="18"/>
+              </w:rPr>
+              <w:t>État canonique, reçus et checkpoints.</w:t>
+            </w:r>
+          </w:p>
+        </w:tc>
+      </w:tr>
+    </w:tbl>
+    <w:p>
+      <w:pPr>
+        <w:spacing w:after="0"/>
+      </w:pPr>
+    </w:p>
+    <w:p>
+      <w:pPr>
+        <w:pStyle w:val="Heading2"/>
+      </w:pPr>
+      <w:r>
+        <w:t>Des effets calculés par le moteur</w:t>
+      </w:r>
+    </w:p>
+    <w:p>
+      <w:pPr/>
+      <w:r>
+        <w:t>Le moteur vérifie les préconditions, applique les intentions acceptées, ajuste budget, confiance et moral, puis fait progresser le travail. Les tâches déjà engagées continuent d’un tour à l’autre. Le temps et les coûts périodiques avancent une seule fois, à la finalisation du tour. Une livraison valide, l’échéance ou une rupture de confiance mettent fin à la partie.</w:t>
       </w:r>
     </w:p>
     <w:p>
@@ -2835,118 +1230,88 @@
         <w:pStyle w:val="Heading2"/>
       </w:pPr>
       <w:r>
-        <w:t>Sources techniques du rapport</w:t>
+        <w:t>Une projection publique explicite</w:t>
+      </w:r>
+    </w:p>
+    <w:p>
+      <w:pPr/>
+      <w:r>
+        <w:t>La simulation conserve des connaissances propres aux personnages. La projection publique filtre l’état et les événements transmis au joueur ; elle alimente aussi la scène 3D. Les sorties verbales du modèle sont présentées séparément des faits écrits par le moteur, afin qu’une réplique ne devienne pas automatiquement une conséquence avérée.</w:t>
+      </w:r>
+    </w:p>
+    <w:p>
+      <w:r>
+        <w:br w:type="page"/>
       </w:r>
     </w:p>
     <w:p>
       <w:pPr>
-        <w:pStyle w:val="ListBullet"/>
-        <w:spacing w:after="80"/>
-        <w:ind w:left="317" w:hanging="202"/>
+        <w:pStyle w:val="Heading1"/>
       </w:pPr>
       <w:r>
-        <w:t>Code source : backend/meltdown/graph.py, engine.py, agents.py, interpreter.py, service.py, projection.py et backend/tests/.</w:t>
+        <w:t>3  Agents et contrats LLM</w:t>
+      </w:r>
+    </w:p>
+    <w:p>
+      <w:pPr/>
+      <w:r>
+        <w:t>L’interpréteur transforme la consigne en zéro, une ou deux actions canoniques. Il reçoit les actions disponibles, les indicateurs, les tâches visibles, la sécurité connue et les huit derniers événements publics. Une ambiguïté demande une précision ou une confirmation sans consommer le tour ; une décision claire est validée par le moteur et résumée avec les titres canoniques.</w:t>
+      </w:r>
+    </w:p>
+    <w:p>
+      <w:pPr/>
+      <w:r>
+        <w:t>Chaque personnage reçoit son rôle, sa pression, ses directives, sa mémoire récente et ses messages. Les faits transmis au modèle doivent être connus du personnage et visibles du joueur. Sa sortie comprend une action, une réplique, une raison, une émotion et, si nécessaire, un destinataire ou une question. Pydantic contrôle la structure ; les validations métier rejettent les actions indisponibles, les faits inconnus et les messages à soi-même.</w:t>
       </w:r>
     </w:p>
     <w:p>
       <w:pPr>
-        <w:pStyle w:val="ListBullet"/>
-        <w:spacing w:after="80"/>
-        <w:ind w:left="317" w:hanging="202"/>
+        <w:keepNext/>
+        <w:spacing w:after="60"/>
+        <w:jc w:val="center"/>
       </w:pPr>
       <w:r>
-        <w:t>Interface : web/components/dashboard.tsx, web/components/office/, web/lib/ et web/tests/.</w:t>
+        <w:drawing>
+          <wp:inline xmlns:a="http://schemas.openxmlformats.org/drawingml/2006/main" xmlns:pic="http://schemas.openxmlformats.org/drawingml/2006/picture">
+            <wp:extent cx="4709160" cy="4640245"/>
+            <wp:docPr id="3" name="Picture 3"/>
+            <wp:cNvGraphicFramePr>
+              <a:graphicFrameLocks noChangeAspect="1"/>
+            </wp:cNvGraphicFramePr>
+            <a:graphic>
+              <a:graphicData uri="http://schemas.openxmlformats.org/drawingml/2006/picture">
+                <pic:pic>
+                  <pic:nvPicPr>
+                    <pic:cNvPr id="0" name="jeu-agents.png"/>
+                    <pic:cNvPicPr/>
+                  </pic:nvPicPr>
+                  <pic:blipFill>
+                    <a:blip r:embed="rId13"/>
+                    <a:stretch>
+                      <a:fillRect/>
+                    </a:stretch>
+                  </pic:blipFill>
+                  <pic:spPr>
+                    <a:xfrm>
+                      <a:off x="0" y="0"/>
+                      <a:ext cx="4709160" cy="4640245"/>
+                    </a:xfrm>
+                    <a:prstGeom prst="rect"/>
+                  </pic:spPr>
+                </pic:pic>
+              </a:graphicData>
+            </a:graphic>
+          </wp:inline>
+        </w:drawing>
       </w:r>
     </w:p>
     <w:p>
       <w:pPr>
-        <w:pStyle w:val="ListBullet"/>
-        <w:spacing w:after="80"/>
-        <w:ind w:left="317" w:hanging="202"/>
+        <w:pStyle w:val="Caption"/>
+        <w:jc w:val="center"/>
       </w:pPr>
       <w:r>
-        <w:t>Conception et méthode : docs/graphe-orchestration.md, docs/arbre-decisionnel.md, docs/model-calibration.md et docs/journal.md.</w:t>
-      </w:r>
-    </w:p>
-    <w:p>
-      <w:pPr>
-        <w:pStyle w:val="ListBullet"/>
-        <w:spacing w:after="80"/>
-        <w:ind w:left="317" w:hanging="202"/>
-      </w:pPr>
-      <w:r>
-        <w:t>Captures du prototype : cinq écrans dans docs/report-assets/ — briefing, tour 2, agents, orchestration et bilan ; dépendances vérifiées dans uv.lock et web/package-lock.json.</w:t>
-      </w:r>
-    </w:p>
-    <w:p>
-      <w:pPr>
-        <w:spacing w:before="80"/>
-      </w:pPr>
-      <w:r>
-        <w:t xml:space="preserve">Documentation officielle : </w:t>
-      </w:r>
-      <w:hyperlink r:id="rId15">
-        <w:r>
-          <w:rPr>
-            <w:color w:val="2D6C7A"/>
-            <w:u w:val="single"/>
-          </w:rPr>
-          <w:t>LangGraph</w:t>
-        </w:r>
-      </w:hyperlink>
-      <w:r>
-        <w:t xml:space="preserve"> · </w:t>
-      </w:r>
-      <w:hyperlink r:id="rId16">
-        <w:r>
-          <w:rPr>
-            <w:color w:val="2D6C7A"/>
-            <w:u w:val="single"/>
-          </w:rPr>
-          <w:t>FastAPI</w:t>
-        </w:r>
-      </w:hyperlink>
-      <w:r>
-        <w:t xml:space="preserve"> · </w:t>
-      </w:r>
-      <w:hyperlink r:id="rId17">
-        <w:r>
-          <w:rPr>
-            <w:color w:val="2D6C7A"/>
-            <w:u w:val="single"/>
-          </w:rPr>
-          <w:t>Next.js</w:t>
-        </w:r>
-      </w:hyperlink>
-      <w:r>
-        <w:t xml:space="preserve"> · </w:t>
-      </w:r>
-      <w:hyperlink r:id="rId18">
-        <w:r>
-          <w:rPr>
-            <w:color w:val="2D6C7A"/>
-            <w:u w:val="single"/>
-          </w:rPr>
-          <w:t>React Three Fiber</w:t>
-        </w:r>
-      </w:hyperlink>
-    </w:p>
-    <w:p>
-      <w:pPr/>
-      <w:r>
-        <w:t xml:space="preserve">Modèle configuré : </w:t>
-      </w:r>
-      <w:hyperlink r:id="rId23">
-        <w:r>
-          <w:rPr>
-            <w:color w:val="4472C4"/>
-            <w:u w:val="single"/>
-          </w:rPr>
-          <w:t>documentation officielle OpenAI de GPT-5.6 Luna</w:t>
-        </w:r>
-      </w:hyperlink>
-      <w:r>
-        <w:t xml:space="preserve"> (sorties structurées prises en charge).</w:t>
+        <w:t>Figure 3 — Les réponses distinguent rôle, émotion, prise de position et justification.</w:t>
       </w:r>
     </w:p>
     <w:p>
@@ -2954,63 +1319,312 @@
         <w:pStyle w:val="Heading2"/>
       </w:pPr>
       <w:r>
-        <w:t>Sources sur l'apprentissage</w:t>
+        <w:t>Correction bornée et budget des appels</w:t>
+      </w:r>
+    </w:p>
+    <w:p>
+      <w:pPr/>
+      <w:r>
+        <w:t>Une sortie invalide autorise une seule génération corrective, soumise aux mêmes contrôles. Un échec persistant conserve la reprise explicite, sans secours à règles. La configuration locale utilise openai:gpt-5.6-luna, raisonnement none, 384 tokens de sortie et un timeout de 20 secondes par tentative fournisseur. Chaque génération conserve une relance fournisseur : une décision logique peut donc atteindre quatre tentatives. Les erreurs fournisseur ne déclenchent pas la correction de sortie ; chaque génération traverse la mesure et le budget du script d’évaluation.</w:t>
       </w:r>
     </w:p>
     <w:p>
       <w:r>
-        <w:t xml:space="preserve">Kolb, D. A. (1984). </w:t>
+        <w:br w:type="page"/>
       </w:r>
+    </w:p>
+    <w:p>
+      <w:pPr>
+        <w:pStyle w:val="Heading1"/>
+      </w:pPr>
       <w:r>
-        <w:rPr>
-          <w:rFonts w:ascii="Aptos" w:hAnsi="Aptos"/>
-          <w:i/>
-        </w:rPr>
-        <w:t>Experiential Learning: Experience as the Source of Learning and Development</w:t>
+        <w:t>4  Le graphe LangGraph et sa persistance</w:t>
       </w:r>
+    </w:p>
+    <w:p>
+      <w:pPr/>
       <w:r>
-        <w:t>. Prentice Hall. Le cycle est utilisé ici comme cadre de conception de l'expérience.</w:t>
+        <w:t>Le graphe pilote l’exécution d’un tour. interrupt suspend le calcul jusqu’à la décision ou à la réponse du joueur ; Command le reprend depuis le checkpoint. Les nœuds ci-dessous correspondent aux fonctions de backend/meltdown/graph.py.</w:t>
+      </w:r>
+    </w:p>
+    <w:p>
+      <w:pPr>
+        <w:keepNext/>
+        <w:spacing w:after="60"/>
+        <w:jc w:val="center"/>
+      </w:pPr>
+      <w:r>
+        <w:drawing>
+          <wp:inline xmlns:a="http://schemas.openxmlformats.org/drawingml/2006/main" xmlns:pic="http://schemas.openxmlformats.org/drawingml/2006/picture">
+            <wp:extent cx="5943600" cy="5448300"/>
+            <wp:docPr id="4" name="Picture 4"/>
+            <wp:cNvGraphicFramePr>
+              <a:graphicFrameLocks noChangeAspect="1"/>
+            </wp:cNvGraphicFramePr>
+            <a:graphic>
+              <a:graphicData uri="http://schemas.openxmlformats.org/drawingml/2006/picture">
+                <pic:pic>
+                  <pic:nvPicPr>
+                    <pic:cNvPr id="0" name="graphe-langgraph-actuel.png"/>
+                    <pic:cNvPicPr/>
+                  </pic:nvPicPr>
+                  <pic:blipFill>
+                    <a:blip r:embed="rId14"/>
+                    <a:stretch>
+                      <a:fillRect/>
+                    </a:stretch>
+                  </pic:blipFill>
+                  <pic:spPr>
+                    <a:xfrm>
+                      <a:off x="0" y="0"/>
+                      <a:ext cx="5943600" cy="5448300"/>
+                    </a:xfrm>
+                    <a:prstGeom prst="rect"/>
+                  </pic:spPr>
+                </pic:pic>
+              </a:graphicData>
+            </a:graphic>
+          </wp:inline>
+        </w:drawing>
+      </w:r>
+    </w:p>
+    <w:p>
+      <w:pPr>
+        <w:pStyle w:val="Caption"/>
+        <w:jc w:val="center"/>
+      </w:pPr>
+      <w:r>
+        <w:t>Figure 4 — Nœuds, branches conditionnelles et boucles du graphe LangGraph courant.</w:t>
+      </w:r>
+    </w:p>
+    <w:p>
+      <w:pPr>
+        <w:pStyle w:val="Heading2"/>
+      </w:pPr>
+      <w:r>
+        <w:t>Lire les étapes et les boucles</w:t>
+      </w:r>
+    </w:p>
+    <w:p>
+      <w:pPr/>
+      <w:r>
+        <w:t>prepare valide les décisions ; organize filtre les observations et sélectionne les personnages. Send distribue le même worker agent en parallèle. resolve attend toutes les intentions, applique leurs effets puis choisit la suite : une seconde ronde de messages, une pause await_answers ou la finalisation. Après une réponse du joueur, seuls les demandeurs sont réactivés ; ce suivi rejoint ensuite finalize. Une livraison déjà validée contourne les agents. finalize fait avancer le temps une seule fois ; coach sélectionne les moments uniquement en fin de partie, puis commit enregistre l’état.</w:t>
+      </w:r>
+    </w:p>
+    <w:p>
+      <w:pPr>
+        <w:pStyle w:val="Heading2"/>
+      </w:pPr>
+      <w:r>
+        <w:t>Conserver et reprendre la partie</w:t>
+      </w:r>
+    </w:p>
+    <w:p>
+      <w:pPr/>
+      <w:r>
+        <w:t>La boucle externe retourne à await_player tant que la partie reste active. SQLite conserve l’état canonique et les reçus ; un second fichier stocke les checkpoints. La version attendue évite les commandes périmées et l’identifiant de requête empêche de rejouer les effets. Le service sérialise les mutations en arrière-plan dans un seul processus ; le navigateur suit leur avancement par polling.</w:t>
       </w:r>
     </w:p>
     <w:p>
       <w:r>
-        <w:t xml:space="preserve">Garris, R., Ahlers, R. et Driskell, J. E. (2002). </w:t>
+        <w:br w:type="page"/>
       </w:r>
-      <w:hyperlink r:id="rId19">
-        <w:r>
-          <w:rPr>
-            <w:color w:val="2D6C7A"/>
-            <w:u w:val="single"/>
-          </w:rPr>
-          <w:t>Games, Motivation, and Learning: A Research and Practice Model</w:t>
-        </w:r>
-      </w:hyperlink>
+    </w:p>
+    <w:p>
+      <w:pPr>
+        <w:pStyle w:val="Heading1"/>
+      </w:pPr>
       <w:r>
-        <w:t>. Simulation &amp; Gaming, 33(4), 441-467.</w:t>
+        <w:t>5  Interface et bureau 3D</w:t>
+      </w:r>
+    </w:p>
+    <w:p>
+      <w:pPr/>
+      <w:r>
+        <w:t>L’interface organise la partie autour de la consigne libre, d’un reçu d’interprétation et d’une chronologie regroupée par tour et par ronde. Le panneau actif expose l’avancement du traitement, rassemble les questions et permet de reprendre une ronde interrompue. Le navigateur mémorise l’identifiant de la partie ; le serveur conserve son contenu.</w:t>
+      </w:r>
+    </w:p>
+    <w:p>
+      <w:pPr>
+        <w:keepNext/>
+        <w:spacing w:after="60"/>
+        <w:jc w:val="center"/>
+      </w:pPr>
+      <w:r>
+        <w:drawing>
+          <wp:inline xmlns:a="http://schemas.openxmlformats.org/drawingml/2006/main" xmlns:pic="http://schemas.openxmlformats.org/drawingml/2006/picture">
+            <wp:extent cx="5943600" cy="3343275"/>
+            <wp:docPr id="5" name="Picture 5"/>
+            <wp:cNvGraphicFramePr>
+              <a:graphicFrameLocks noChangeAspect="1"/>
+            </wp:cNvGraphicFramePr>
+            <a:graphic>
+              <a:graphicData uri="http://schemas.openxmlformats.org/drawingml/2006/picture">
+                <pic:pic>
+                  <pic:nvPicPr>
+                    <pic:cNvPr id="0" name="jeu-tour-2.png"/>
+                    <pic:cNvPicPr/>
+                  </pic:nvPicPr>
+                  <pic:blipFill>
+                    <a:blip r:embed="rId15"/>
+                    <a:stretch>
+                      <a:fillRect/>
+                    </a:stretch>
+                  </pic:blipFill>
+                  <pic:spPr>
+                    <a:xfrm>
+                      <a:off x="0" y="0"/>
+                      <a:ext cx="5943600" cy="3343275"/>
+                    </a:xfrm>
+                    <a:prstGeom prst="rect"/>
+                  </pic:spPr>
+                </pic:pic>
+              </a:graphicData>
+            </a:graphic>
+          </wp:inline>
+        </w:drawing>
+      </w:r>
+    </w:p>
+    <w:p>
+      <w:pPr>
+        <w:pStyle w:val="Caption"/>
+        <w:jc w:val="center"/>
+      </w:pPr>
+      <w:r>
+        <w:t>Figure 5 — La scène, les tâches et le journal décrivent le même état enregistré.</w:t>
+      </w:r>
+    </w:p>
+    <w:p>
+      <w:pPr>
+        <w:pStyle w:val="Heading2"/>
+      </w:pPr>
+      <w:r>
+        <w:t>Une visualisation liée aux événements</w:t>
+      </w:r>
+    </w:p>
+    <w:p>
+      <w:pPr/>
+      <w:r>
+        <w:t>Le bureau est construit avec des géométries low-poly locales, sans modèle 3D ni texture externe. Les quatre personnages sont sélectionnables ; leur fiche expose leur état et rejoint leur événement dans le journal. La pression influence leur présentation, les négociations publiques rapprochent les interlocuteurs et la sécurité vérifiée modifie le signal de livraison. Ces éléments illustrent la simulation et n’ajoutent aucun effet métier ni appel LLM.</w:t>
+      </w:r>
+    </w:p>
+    <w:p>
+      <w:pPr>
+        <w:pStyle w:val="Heading2"/>
+      </w:pPr>
+      <w:r>
+        <w:t>Une méthode par incréments vérifiables</w:t>
+      </w:r>
+    </w:p>
+    <w:p>
+      <w:pPr/>
+      <w:r>
+        <w:t>Le projet a été réalisé par étapes jouables : scénario et règles, API et persistance, orchestration, consignes naturelles, puis bureau 3D. Les tests protègent les frontières métier et les reprises ; des parcours dans le produit complètent ces vérifications. L’assistance IA a contribué à la conception, au code, à la revue et à la documentation.</w:t>
       </w:r>
     </w:p>
     <w:p>
       <w:r>
-        <w:t xml:space="preserve">Crookall, D. (2010). </w:t>
+        <w:br w:type="page"/>
       </w:r>
-      <w:hyperlink r:id="rId20">
-        <w:r>
-          <w:rPr>
-            <w:color w:val="2D6C7A"/>
-            <w:u w:val="single"/>
-          </w:rPr>
-          <w:t>Serious Games, Debriefing, and Simulation/Gaming as a Discipline</w:t>
-        </w:r>
-      </w:hyperlink>
+    </w:p>
+    <w:p>
+      <w:pPr>
+        <w:pStyle w:val="Heading1"/>
+      </w:pPr>
       <w:r>
-        <w:t>. Simulation &amp; Gaming, 41(6), 898-920.</w:t>
+        <w:t>6  Débrief et validation</w:t>
+      </w:r>
+    </w:p>
+    <w:p>
+      <w:pPr/>
+      <w:r>
+        <w:t>Le coach sélectionne jusqu’à trois moments parmi tous les événements pédagogiques publics éligibles, y compris les événements tardifs et les répétitions d’un même type. Les identifiants doivent être connus et uniques. Le texte factuel reste rédigé par le moteur ; les pistes alternatives proposent d’autres stratégies à essayer, sans prétendre simuler leurs résultats.</w:t>
+      </w:r>
+    </w:p>
+    <w:p>
+      <w:pPr>
+        <w:keepNext/>
+        <w:spacing w:after="60"/>
+        <w:jc w:val="center"/>
+      </w:pPr>
+      <w:r>
+        <w:drawing>
+          <wp:inline xmlns:a="http://schemas.openxmlformats.org/drawingml/2006/main" xmlns:pic="http://schemas.openxmlformats.org/drawingml/2006/picture">
+            <wp:extent cx="5943600" cy="3343275"/>
+            <wp:docPr id="6" name="Picture 6"/>
+            <wp:cNvGraphicFramePr>
+              <a:graphicFrameLocks noChangeAspect="1"/>
+            </wp:cNvGraphicFramePr>
+            <a:graphic>
+              <a:graphicData uri="http://schemas.openxmlformats.org/drawingml/2006/picture">
+                <pic:pic>
+                  <pic:nvPicPr>
+                    <pic:cNvPr id="0" name="jeu-bilan.png"/>
+                    <pic:cNvPicPr/>
+                  </pic:nvPicPr>
+                  <pic:blipFill>
+                    <a:blip r:embed="rId16"/>
+                    <a:stretch>
+                      <a:fillRect/>
+                    </a:stretch>
+                  </pic:blipFill>
+                  <pic:spPr>
+                    <a:xfrm>
+                      <a:off x="0" y="0"/>
+                      <a:ext cx="5943600" cy="3343275"/>
+                    </a:xfrm>
+                    <a:prstGeom prst="rect"/>
+                  </pic:spPr>
+                </pic:pic>
+              </a:graphicData>
+            </a:graphic>
+          </wp:inline>
+        </w:drawing>
+      </w:r>
+    </w:p>
+    <w:p>
+      <w:pPr>
+        <w:pStyle w:val="Caption"/>
+        <w:jc w:val="center"/>
+      </w:pPr>
+      <w:r>
+        <w:t>Figure 6 — Exemple de débrief relié aux événements et aux indicateurs de la partie.</w:t>
+      </w:r>
+    </w:p>
+    <w:p>
+      <w:pPr>
+        <w:pStyle w:val="Heading2"/>
+      </w:pPr>
+      <w:r>
+        <w:t>Ce que les vérifications établissent</w:t>
+      </w:r>
+    </w:p>
+    <w:p>
+      <w:pPr/>
+      <w:r>
+        <w:t>La suite compte 56 tests backend et 10 tests frontend passants ; Ruff et le build de production Next.js réussissent. Les tests couvrent notamment les règles, la confidentialité, la persistance, la correction limitée des sorties LLM et la sélection du coach. Un test traverse le service pour vérifier qu’une correction n’ajoute ni tour ni coût ; un autre termine une partie et contrôle les événements transmis au coach.</w:t>
+      </w:r>
+    </w:p>
+    <w:p>
+      <w:pPr/>
+      <w:r>
+        <w:t>Un parcours enregistré dans l’interface aboutit en cinq tours à 100 % de progression, un budget de 34/100, une confiance de 73/100, un moral de 60/100 et une sécurité vérifiée. Les captures illustrent ce parcours et des vues du prototype. Elles ne mesurent pas la fiabilité des prompts actuels : la campagne technique utilise des réponses fournisseur simulées, sans nouvel essai payant du contrat LLM.</w:t>
+      </w:r>
+    </w:p>
+    <w:p>
+      <w:pPr/>
+      <w:r>
+        <w:rPr>
+          <w:sz w:val="17"/>
+        </w:rPr>
+        <w:t>Sources du projet : backend/meltdown/ pour les règles, contrats et orchestration ; web/ pour l’interface ; docs/evidence/llm-improvements-checks.txt pour les contrôles ; docs/model-calibration.md pour les mesures archivées. Les fichiers uv.lock et web/package-lock.json fixent les dépendances. Captures : docs/report-assets/.</w:t>
       </w:r>
     </w:p>
     <w:sectPr>
       <w:headerReference w:type="default" r:id="rId9"/>
       <w:footerReference w:type="default" r:id="rId10"/>
-      <w:pgSz w:w="12240" w:h="15840"/>
-      <w:pgMar w:top="979" w:right="1037" w:bottom="936" w:left="1037" w:header="360" w:footer="403" w:gutter="0"/>
+      <w:pgSz w:w="11905" w:h="16838"/>
+      <w:pgMar w:top="864" w:right="1037" w:bottom="864" w:left="1037" w:header="360" w:footer="360" w:gutter="0"/>
       <w:cols w:space="720"/>
       <w:docGrid w:linePitch="360"/>
     </w:sectPr>
@@ -3027,15 +1641,11 @@
     </w:pPr>
     <w:r>
       <w:rPr>
-        <w:rFonts w:ascii="Aptos" w:hAnsi="Aptos"/>
-        <w:color w:val="526170"/>
-        <w:sz w:val="18"/>
-      </w:rPr>
-      <w:t xml:space="preserve">Page </w:t>
-      <w:fldChar w:fldCharType="begin"/>
-      <w:instrText xml:space="preserve"> PAGE </w:instrText>
-      <w:fldChar w:fldCharType="end"/>
+        <w:sz w:val="16"/>
+      </w:rPr>
+      <w:t xml:space="preserve">Project Meltdown  ·  </w:t>
     </w:r>
+    <w:fldSimple w:instr="PAGE"/>
   </w:p>
 </w:ftr>
 </file>
@@ -3049,12 +1659,9 @@
     </w:pPr>
     <w:r>
       <w:rPr>
-        <w:rFonts w:ascii="Aptos" w:hAnsi="Aptos"/>
-        <w:b/>
-        <w:color w:val="526170"/>
         <w:sz w:val="16"/>
       </w:rPr>
-      <w:t>SCIA HACKATHON 2026   |   PROJECT MELTDOWN</w:t>
+      <w:t>PROJECT MELTDOWN  |  RAPPORT TECHNIQUE</w:t>
     </w:r>
   </w:p>
 </w:hdr>
@@ -3424,12 +2031,12 @@
     <w:qFormat/>
     <w:rsid w:val="00FC693F"/>
     <w:pPr>
-      <w:spacing w:after="120" w:line="259" w:lineRule="auto"/>
+      <w:spacing w:line="259" w:lineRule="auto" w:after="140"/>
     </w:pPr>
     <w:rPr>
-      <w:rFonts w:ascii="Aptos" w:hAnsi="Aptos"/>
+      <w:rFonts w:ascii="Arial" w:hAnsi="Arial"/>
       <w:color w:val="000000"/>
-      <w:sz w:val="21"/>
+      <w:sz w:val="20"/>
     </w:rPr>
   </w:style>
   <w:style w:type="paragraph" w:styleId="Header">
@@ -3487,15 +2094,15 @@
     <w:pPr>
       <w:keepNext/>
       <w:keepLines/>
-      <w:spacing w:before="200" w:after="100"/>
+      <w:spacing w:before="200" w:after="120"/>
       <w:outlineLvl w:val="0"/>
     </w:pPr>
     <w:rPr>
-      <w:rFonts w:asciiTheme="majorHAnsi" w:eastAsiaTheme="majorEastAsia" w:hAnsiTheme="majorHAnsi" w:cstheme="majorBidi" w:ascii="Aptos Display" w:hAnsi="Aptos Display"/>
+      <w:rFonts w:asciiTheme="majorHAnsi" w:eastAsiaTheme="majorEastAsia" w:hAnsiTheme="majorHAnsi" w:cstheme="majorBidi" w:ascii="Arial" w:hAnsi="Arial"/>
       <w:b/>
       <w:bCs/>
       <w:color w:val="000000"/>
-      <w:sz w:val="32"/>
+      <w:sz w:val="36"/>
       <w:szCs w:val="28"/>
     </w:rPr>
   </w:style>
@@ -3511,15 +2118,15 @@
     <w:pPr>
       <w:keepNext/>
       <w:keepLines/>
-      <w:spacing w:before="140" w:after="100"/>
+      <w:spacing w:before="200" w:after="120"/>
       <w:outlineLvl w:val="1"/>
     </w:pPr>
     <w:rPr>
-      <w:rFonts w:asciiTheme="majorHAnsi" w:eastAsiaTheme="majorEastAsia" w:hAnsiTheme="majorHAnsi" w:cstheme="majorBidi" w:ascii="Aptos Display" w:hAnsi="Aptos Display"/>
+      <w:rFonts w:asciiTheme="majorHAnsi" w:eastAsiaTheme="majorEastAsia" w:hAnsiTheme="majorHAnsi" w:cstheme="majorBidi" w:ascii="Arial" w:hAnsi="Arial"/>
       <w:b/>
       <w:bCs/>
       <w:color w:val="000000"/>
-      <w:sz w:val="24"/>
+      <w:sz w:val="23"/>
       <w:szCs w:val="26"/>
     </w:rPr>
   </w:style>
@@ -3773,16 +2380,15 @@
     <w:qFormat/>
     <w:rsid w:val="00FC693F"/>
     <w:pPr>
-      <w:spacing w:after="300" w:line="240" w:lineRule="auto"/>
+      <w:spacing w:after="60" w:line="240" w:lineRule="auto"/>
       <w:contextualSpacing/>
     </w:pPr>
     <w:rPr>
-      <w:rFonts w:asciiTheme="majorHAnsi" w:eastAsiaTheme="majorEastAsia" w:hAnsiTheme="majorHAnsi" w:cstheme="majorBidi" w:ascii="Aptos Display" w:hAnsi="Aptos Display"/>
-      <w:b/>
+      <w:rFonts w:asciiTheme="majorHAnsi" w:eastAsiaTheme="majorEastAsia" w:hAnsiTheme="majorHAnsi" w:cstheme="majorBidi" w:ascii="Arial" w:hAnsi="Arial"/>
       <w:color w:val="000000"/>
       <w:spacing w:val="5"/>
       <w:kern w:val="28"/>
-      <w:sz w:val="60"/>
+      <w:sz w:val="56"/>
       <w:szCs w:val="52"/>
     </w:rPr>
   </w:style>
@@ -3813,14 +2419,15 @@
       <w:numPr>
         <w:ilvl w:val="1"/>
       </w:numPr>
+      <w:spacing w:after="100"/>
     </w:pPr>
     <w:rPr>
-      <w:rFonts w:asciiTheme="majorHAnsi" w:eastAsiaTheme="majorEastAsia" w:hAnsiTheme="majorHAnsi" w:cstheme="majorBidi"/>
-      <w:i/>
+      <w:rFonts w:asciiTheme="majorHAnsi" w:eastAsiaTheme="majorEastAsia" w:hAnsiTheme="majorHAnsi" w:cstheme="majorBidi" w:ascii="Arial" w:hAnsi="Arial"/>
+      <w:i w:val="0"/>
       <w:iCs/>
-      <w:color w:val="4F81BD" w:themeColor="accent1"/>
+      <w:color w:val="000000"/>
       <w:spacing w:val="15"/>
-      <w:sz w:val="24"/>
+      <w:sz w:val="26"/>
       <w:szCs w:val="24"/>
     </w:rPr>
   </w:style>
@@ -3958,10 +2565,6 @@
       </w:numPr>
       <w:contextualSpacing/>
     </w:pPr>
-    <w:rPr>
-      <w:rFonts w:ascii="Aptos" w:hAnsi="Aptos"/>
-      <w:sz w:val="20"/>
-    </w:rPr>
   </w:style>
   <w:style w:type="paragraph" w:styleId="ListBullet2">
     <w:name w:val="List Bullet 2"/>
@@ -4001,10 +2604,6 @@
       </w:numPr>
       <w:contextualSpacing/>
     </w:pPr>
-    <w:rPr>
-      <w:rFonts w:ascii="Aptos" w:hAnsi="Aptos"/>
-      <w:sz w:val="20"/>
-    </w:rPr>
   </w:style>
   <w:style w:type="paragraph" w:styleId="ListNumber2">
     <w:name w:val="List Number 2"/>
@@ -4225,13 +2824,15 @@
     <w:qFormat/>
     <w:rsid w:val="00FC693F"/>
     <w:pPr>
-      <w:spacing w:line="240" w:lineRule="auto"/>
+      <w:spacing w:line="240" w:lineRule="auto" w:after="180"/>
     </w:pPr>
     <w:rPr>
-      <w:b/>
+      <w:rFonts w:ascii="Arial" w:hAnsi="Arial"/>
+      <w:b w:val="0"/>
       <w:bCs/>
-      <w:color w:val="4F81BD" w:themeColor="accent1"/>
-      <w:sz w:val="18"/>
+      <w:i/>
+      <w:color w:val="000000"/>
+      <w:sz w:val="16"/>
       <w:szCs w:val="18"/>
     </w:rPr>
   </w:style>
@@ -4266,9 +2867,6 @@
     <w:qFormat/>
     <w:rsid w:val="00FC693F"/>
     <w:pPr>
-      <w:pBdr>
-        <w:bottom w:val="single" w:sz="4" w:space="4" w:color="4F81BD" w:themeColor="accent1"/>
-      </w:pBdr>
       <w:spacing w:before="200" w:after="280"/>
       <w:ind w:left="936" w:right="936"/>
     </w:pPr>

</xml_diff>